<commit_message>
Synchronize assignments 1-3 with lab manual theory and add GitHub link below conclusion
</commit_message>
<xml_diff>
--- a/Assignment_2_Quick_Sort/Assignment_2_Quick_Sort.docx
+++ b/Assignment_2_Quick_Sort/Assignment_2_Quick_Sort.docx
@@ -8,7 +8,7 @@
         <w:shd w:val="clear" w:color="auto" w:fill="F4F7FA"/>
         <w:spacing w:before="0" w:after="0" w:afterAutospacing="0"/>
         <w:jc w:val="center"/>
-        <w:divId w:val="1368600147"/>
+        <w:divId w:val="555899539"/>
         <w:rPr>
           <w:rFonts w:ascii="Calibri" w:eastAsia="Times New Roman" w:hAnsi="Calibri" w:cs="Calibri"/>
           <w:color w:val="003366"/>
@@ -27,7 +27,7 @@
         <w:pStyle w:val="Heading1"/>
         <w:shd w:val="clear" w:color="auto" w:fill="F4F7FA"/>
         <w:spacing w:before="75" w:beforeAutospacing="0"/>
-        <w:divId w:val="1368600147"/>
+        <w:divId w:val="555899539"/>
         <w:rPr>
           <w:rFonts w:ascii="Calibri" w:eastAsia="Times New Roman" w:hAnsi="Calibri" w:cs="Calibri"/>
         </w:rPr>
@@ -45,7 +45,7 @@
         <w:shd w:val="clear" w:color="auto" w:fill="F4F7FA"/>
         <w:spacing w:before="0" w:beforeAutospacing="0" w:after="0" w:afterAutospacing="0"/>
         <w:jc w:val="center"/>
-        <w:divId w:val="1368600147"/>
+        <w:divId w:val="555899539"/>
         <w:rPr>
           <w:rFonts w:ascii="Calibri" w:hAnsi="Calibri" w:cs="Calibri"/>
           <w:i/>
@@ -69,7 +69,7 @@
         <w:shd w:val="clear" w:color="auto" w:fill="F4F7FA"/>
         <w:spacing w:before="45" w:beforeAutospacing="0" w:after="45" w:afterAutospacing="0"/>
         <w:jc w:val="center"/>
-        <w:divId w:val="1368600147"/>
+        <w:divId w:val="555899539"/>
         <w:rPr>
           <w:rFonts w:ascii="Calibri" w:hAnsi="Calibri" w:cs="Calibri"/>
           <w:color w:val="1A1A1A"/>
@@ -91,18 +91,18 @@
       <w:pPr>
         <w:shd w:val="clear" w:color="auto" w:fill="F4F7FA"/>
         <w:jc w:val="center"/>
-        <w:divId w:val="1368600147"/>
-        <w:rPr>
-          <w:rFonts w:ascii="Calibri" w:eastAsia="Times New Roman" w:hAnsi="Calibri" w:cs="Calibri"/>
-          <w:color w:val="1A1A1A"/>
-        </w:rPr>
-      </w:pPr>
-      <w:r>
-        <w:rPr>
-          <w:rFonts w:ascii="Calibri" w:eastAsia="Times New Roman" w:hAnsi="Calibri" w:cs="Calibri"/>
-          <w:color w:val="1A1A1A"/>
-        </w:rPr>
-        <w:pict w14:anchorId="54DB099A">
+        <w:divId w:val="555899539"/>
+        <w:rPr>
+          <w:rFonts w:ascii="Calibri" w:eastAsia="Times New Roman" w:hAnsi="Calibri" w:cs="Calibri"/>
+          <w:color w:val="1A1A1A"/>
+        </w:rPr>
+      </w:pPr>
+      <w:r>
+        <w:rPr>
+          <w:rFonts w:ascii="Calibri" w:eastAsia="Times New Roman" w:hAnsi="Calibri" w:cs="Calibri"/>
+          <w:color w:val="1A1A1A"/>
+        </w:rPr>
+        <w:pict w14:anchorId="4DD0AD14">
           <v:rect id="_x0000_i1025" style="width:0;height:1.5pt" o:hralign="center" o:hrstd="t" o:hr="t" fillcolor="#a0a0a0" stroked="f"/>
         </w:pict>
       </w:r>
@@ -116,7 +116,7 @@
         <w:shd w:val="clear" w:color="auto" w:fill="F4F7FA"/>
         <w:spacing w:before="75" w:after="75" w:afterAutospacing="0"/>
         <w:jc w:val="center"/>
-        <w:divId w:val="1368600147"/>
+        <w:divId w:val="555899539"/>
         <w:rPr>
           <w:rFonts w:ascii="Calibri" w:eastAsia="Times New Roman" w:hAnsi="Calibri" w:cs="Calibri"/>
           <w:color w:val="003366"/>
@@ -127,7 +127,7 @@
           <w:rFonts w:ascii="Calibri" w:eastAsia="Times New Roman" w:hAnsi="Calibri" w:cs="Calibri"/>
           <w:color w:val="003366"/>
         </w:rPr>
-        <w:t>Assignment No 2: Quick Sort</w:t>
+        <w:t>Assignment No. 2: Quick Sort</w:t>
       </w:r>
     </w:p>
     <w:p>
@@ -135,7 +135,7 @@
         <w:pStyle w:val="NormalWeb"/>
         <w:shd w:val="clear" w:color="auto" w:fill="EEF4FB"/>
         <w:spacing w:before="45" w:beforeAutospacing="0" w:after="45" w:afterAutospacing="0"/>
-        <w:divId w:val="1194080670"/>
+        <w:divId w:val="1439838459"/>
         <w:rPr>
           <w:rFonts w:ascii="Calibri" w:hAnsi="Calibri" w:cs="Calibri"/>
           <w:b/>
@@ -166,7 +166,7 @@
         <w:pStyle w:val="NormalWeb"/>
         <w:shd w:val="clear" w:color="auto" w:fill="EEF4FB"/>
         <w:spacing w:before="45" w:beforeAutospacing="0" w:after="45" w:afterAutospacing="0"/>
-        <w:divId w:val="1194080670"/>
+        <w:divId w:val="1439838459"/>
         <w:rPr>
           <w:rFonts w:ascii="Calibri" w:hAnsi="Calibri" w:cs="Calibri"/>
           <w:b/>
@@ -197,7 +197,7 @@
         <w:pStyle w:val="NormalWeb"/>
         <w:shd w:val="clear" w:color="auto" w:fill="EEF4FB"/>
         <w:spacing w:before="45" w:beforeAutospacing="0" w:after="45" w:afterAutospacing="0"/>
-        <w:divId w:val="1194080670"/>
+        <w:divId w:val="1439838459"/>
         <w:rPr>
           <w:rFonts w:ascii="Calibri" w:hAnsi="Calibri" w:cs="Calibri"/>
           <w:b/>
@@ -228,7 +228,7 @@
         <w:pStyle w:val="NormalWeb"/>
         <w:shd w:val="clear" w:color="auto" w:fill="EEF4FB"/>
         <w:spacing w:before="45" w:beforeAutospacing="0" w:after="45" w:afterAutospacing="0"/>
-        <w:divId w:val="1194080670"/>
+        <w:divId w:val="1439838459"/>
         <w:rPr>
           <w:rFonts w:ascii="Calibri" w:hAnsi="Calibri" w:cs="Calibri"/>
           <w:b/>
@@ -257,7 +257,7 @@
     <w:p>
       <w:pPr>
         <w:pStyle w:val="Heading2"/>
-        <w:divId w:val="1978336600"/>
+        <w:divId w:val="1128549756"/>
         <w:rPr>
           <w:rFonts w:ascii="Calibri" w:eastAsia="Times New Roman" w:hAnsi="Calibri" w:cs="Calibri"/>
         </w:rPr>
@@ -272,33 +272,18 @@
     <w:p>
       <w:pPr>
         <w:pStyle w:val="NormalWeb"/>
-        <w:divId w:val="1978336600"/>
-        <w:rPr>
-          <w:rFonts w:ascii="Calibri" w:hAnsi="Calibri" w:cs="Calibri"/>
-          <w:color w:val="1A1A1A"/>
-        </w:rPr>
-      </w:pPr>
-      <w:r>
-        <w:rPr>
-          <w:rFonts w:ascii="Calibri" w:hAnsi="Calibri" w:cs="Calibri"/>
-          <w:color w:val="1A1A1A"/>
-        </w:rPr>
-        <w:t xml:space="preserve">A popular OTT platform, </w:t>
-      </w:r>
-      <w:r>
-        <w:rPr>
-          <w:rStyle w:val="Strong"/>
-          <w:rFonts w:ascii="Calibri" w:hAnsi="Calibri" w:cs="Calibri"/>
-          <w:color w:val="1A1A1A"/>
-        </w:rPr>
-        <w:t>StreamFlix</w:t>
-      </w:r>
-      <w:r>
-        <w:rPr>
-          <w:rFonts w:ascii="Calibri" w:hAnsi="Calibri" w:cs="Calibri"/>
-          <w:color w:val="1A1A1A"/>
-        </w:rPr>
-        <w:t>, offers personalized recommendations by sorting movies based on user preferences, such as IMDb rating, release year, or watch time popularity. However, during peak hours, sorting large datasets slows down the system. As a backend engineer, you must:</w:t>
+        <w:divId w:val="1128549756"/>
+        <w:rPr>
+          <w:rFonts w:ascii="Calibri" w:hAnsi="Calibri" w:cs="Calibri"/>
+          <w:color w:val="1A1A1A"/>
+        </w:rPr>
+      </w:pPr>
+      <w:r>
+        <w:rPr>
+          <w:rFonts w:ascii="Calibri" w:hAnsi="Calibri" w:cs="Calibri"/>
+          <w:color w:val="1A1A1A"/>
+        </w:rPr>
+        <w:t>Movie Recommendation System Optimization A popular OTT platform, StreamFlix, offers personalized recommendations by sorting movies based on user preferences, such as IMDB rating, release year, or watch time popularity. However, during peak hours, sorting large datasets slows down the system. As a backend engineer, you must:</w:t>
       </w:r>
     </w:p>
     <w:p>
@@ -308,18 +293,18 @@
           <w:numId w:val="1"/>
         </w:numPr>
         <w:spacing w:before="100" w:beforeAutospacing="1" w:after="100" w:afterAutospacing="1"/>
-        <w:divId w:val="1978336600"/>
-        <w:rPr>
-          <w:rFonts w:ascii="Calibri" w:eastAsia="Times New Roman" w:hAnsi="Calibri" w:cs="Calibri"/>
-          <w:color w:val="1A1A1A"/>
-        </w:rPr>
-      </w:pPr>
-      <w:r>
-        <w:rPr>
-          <w:rFonts w:ascii="Calibri" w:eastAsia="Times New Roman" w:hAnsi="Calibri" w:cs="Calibri"/>
-          <w:color w:val="1A1A1A"/>
-        </w:rPr>
-        <w:t>Implement Quicksort to efficiently sort movies based on various user-selected parameters.</w:t>
+        <w:divId w:val="1128549756"/>
+        <w:rPr>
+          <w:rFonts w:ascii="Calibri" w:eastAsia="Times New Roman" w:hAnsi="Calibri" w:cs="Calibri"/>
+          <w:color w:val="1A1A1A"/>
+        </w:rPr>
+      </w:pPr>
+      <w:r>
+        <w:rPr>
+          <w:rFonts w:ascii="Calibri" w:eastAsia="Times New Roman" w:hAnsi="Calibri" w:cs="Calibri"/>
+          <w:color w:val="1A1A1A"/>
+        </w:rPr>
+        <w:t>Implement Quick sort to efficiently sort movies based on various user-selected parameters.</w:t>
       </w:r>
     </w:p>
     <w:p>
@@ -329,24 +314,24 @@
           <w:numId w:val="1"/>
         </w:numPr>
         <w:spacing w:before="100" w:beforeAutospacing="1" w:after="100" w:afterAutospacing="1"/>
-        <w:divId w:val="1978336600"/>
-        <w:rPr>
-          <w:rFonts w:ascii="Calibri" w:eastAsia="Times New Roman" w:hAnsi="Calibri" w:cs="Calibri"/>
-          <w:color w:val="1A1A1A"/>
-        </w:rPr>
-      </w:pPr>
-      <w:r>
-        <w:rPr>
-          <w:rFonts w:ascii="Calibri" w:eastAsia="Times New Roman" w:hAnsi="Calibri" w:cs="Calibri"/>
-          <w:color w:val="1A1A1A"/>
-        </w:rPr>
-        <w:t>Handle large datasets containing movies while maintaining fast response times.</w:t>
+        <w:divId w:val="1128549756"/>
+        <w:rPr>
+          <w:rFonts w:ascii="Calibri" w:eastAsia="Times New Roman" w:hAnsi="Calibri" w:cs="Calibri"/>
+          <w:color w:val="1A1A1A"/>
+        </w:rPr>
+      </w:pPr>
+      <w:r>
+        <w:rPr>
+          <w:rFonts w:ascii="Calibri" w:eastAsia="Times New Roman" w:hAnsi="Calibri" w:cs="Calibri"/>
+          <w:color w:val="1A1A1A"/>
+        </w:rPr>
+        <w:t>Handle large datasets containing of movies while maintaining fast response times.</w:t>
       </w:r>
     </w:p>
     <w:p>
       <w:pPr>
         <w:pStyle w:val="Heading2"/>
-        <w:divId w:val="1978336600"/>
+        <w:divId w:val="1128549756"/>
         <w:rPr>
           <w:rFonts w:ascii="Calibri" w:eastAsia="Times New Roman" w:hAnsi="Calibri" w:cs="Calibri"/>
         </w:rPr>
@@ -356,6 +341,121 @@
           <w:rFonts w:ascii="Calibri" w:eastAsia="Times New Roman" w:hAnsi="Calibri" w:cs="Calibri"/>
         </w:rPr>
         <w:t>2. Course Objective:</w:t>
+      </w:r>
+    </w:p>
+    <w:p>
+      <w:pPr>
+        <w:pStyle w:val="NormalWeb"/>
+        <w:divId w:val="1128549756"/>
+        <w:rPr>
+          <w:rFonts w:ascii="Calibri" w:hAnsi="Calibri" w:cs="Calibri"/>
+          <w:color w:val="1A1A1A"/>
+        </w:rPr>
+      </w:pPr>
+      <w:r>
+        <w:rPr>
+          <w:rFonts w:ascii="Calibri" w:hAnsi="Calibri" w:cs="Calibri"/>
+          <w:color w:val="1A1A1A"/>
+        </w:rPr>
+        <w:t>2.1 To know the basics of computational complexity of various algorithms.</w:t>
+      </w:r>
+      <w:r>
+        <w:rPr>
+          <w:rFonts w:ascii="Calibri" w:hAnsi="Calibri" w:cs="Calibri"/>
+          <w:color w:val="1A1A1A"/>
+        </w:rPr>
+        <w:br/>
+        <w:t>2.2 To select appropriate algorithm design strategies to solve real-world problems.</w:t>
+      </w:r>
+    </w:p>
+    <w:p>
+      <w:pPr>
+        <w:pStyle w:val="Heading2"/>
+        <w:divId w:val="1128549756"/>
+        <w:rPr>
+          <w:rFonts w:ascii="Calibri" w:eastAsia="Times New Roman" w:hAnsi="Calibri" w:cs="Calibri"/>
+        </w:rPr>
+      </w:pPr>
+      <w:r>
+        <w:rPr>
+          <w:rFonts w:ascii="Calibri" w:eastAsia="Times New Roman" w:hAnsi="Calibri" w:cs="Calibri"/>
+        </w:rPr>
+        <w:t>3. Course Outcome:</w:t>
+      </w:r>
+    </w:p>
+    <w:p>
+      <w:pPr>
+        <w:pStyle w:val="NormalWeb"/>
+        <w:divId w:val="1128549756"/>
+        <w:rPr>
+          <w:rFonts w:ascii="Calibri" w:hAnsi="Calibri" w:cs="Calibri"/>
+          <w:color w:val="1A1A1A"/>
+        </w:rPr>
+      </w:pPr>
+      <w:r>
+        <w:rPr>
+          <w:rFonts w:ascii="Calibri" w:hAnsi="Calibri" w:cs="Calibri"/>
+          <w:color w:val="1A1A1A"/>
+        </w:rPr>
+        <w:t>3.1 Analyze the asymptotic performance of algorithms.</w:t>
+      </w:r>
+      <w:r>
+        <w:rPr>
+          <w:rFonts w:ascii="Calibri" w:hAnsi="Calibri" w:cs="Calibri"/>
+          <w:color w:val="1A1A1A"/>
+        </w:rPr>
+        <w:br/>
+        <w:t>3.2 Solve computational problems by applying suitable paradigms of Divide and Conquer or Greedy methodologies.</w:t>
+      </w:r>
+    </w:p>
+    <w:p>
+      <w:pPr>
+        <w:pStyle w:val="Heading2"/>
+        <w:divId w:val="1128549756"/>
+        <w:rPr>
+          <w:rFonts w:ascii="Calibri" w:eastAsia="Times New Roman" w:hAnsi="Calibri" w:cs="Calibri"/>
+        </w:rPr>
+      </w:pPr>
+      <w:r>
+        <w:rPr>
+          <w:rFonts w:ascii="Calibri" w:eastAsia="Times New Roman" w:hAnsi="Calibri" w:cs="Calibri"/>
+        </w:rPr>
+        <w:t>4. Theory:</w:t>
+      </w:r>
+    </w:p>
+    <w:p>
+      <w:pPr>
+        <w:pStyle w:val="NormalWeb"/>
+        <w:divId w:val="1128549756"/>
+        <w:rPr>
+          <w:rFonts w:ascii="Calibri" w:hAnsi="Calibri" w:cs="Calibri"/>
+          <w:color w:val="1A1A1A"/>
+        </w:rPr>
+      </w:pPr>
+      <w:r>
+        <w:rPr>
+          <w:rFonts w:ascii="Calibri" w:hAnsi="Calibri" w:cs="Calibri"/>
+          <w:color w:val="1A1A1A"/>
+        </w:rPr>
+        <w:lastRenderedPageBreak/>
+        <w:t>Quick Sort is one of the most widely used sorting algorithms because of its efficiency, simplicity in concept, and adaptability. It is based on the divide-and-conquer paradigm, which makes it highly effective in sorting large datasets. Unlike some other sorting algorithms, Quick Sort is an in-place algorithm, meaning it requires very little extra memory, and it avoids the overhead of merging, as seen in Merge Sort.</w:t>
+      </w:r>
+    </w:p>
+    <w:p>
+      <w:pPr>
+        <w:pStyle w:val="NormalWeb"/>
+        <w:divId w:val="1128549756"/>
+        <w:rPr>
+          <w:rFonts w:ascii="Calibri" w:hAnsi="Calibri" w:cs="Calibri"/>
+          <w:color w:val="1A1A1A"/>
+        </w:rPr>
+      </w:pPr>
+      <w:r>
+        <w:rPr>
+          <w:rFonts w:ascii="Calibri" w:hAnsi="Calibri" w:cs="Calibri"/>
+          <w:color w:val="1A1A1A"/>
+        </w:rPr>
+        <w:t>The working of Quick Sort can be explained in three major steps:</w:t>
       </w:r>
     </w:p>
     <w:p>
@@ -365,18 +465,33 @@
           <w:numId w:val="2"/>
         </w:numPr>
         <w:spacing w:before="100" w:beforeAutospacing="1" w:after="100" w:afterAutospacing="1"/>
-        <w:divId w:val="1978336600"/>
-        <w:rPr>
-          <w:rFonts w:ascii="Calibri" w:eastAsia="Times New Roman" w:hAnsi="Calibri" w:cs="Calibri"/>
-          <w:color w:val="1A1A1A"/>
-        </w:rPr>
-      </w:pPr>
-      <w:r>
-        <w:rPr>
-          <w:rFonts w:ascii="Calibri" w:eastAsia="Times New Roman" w:hAnsi="Calibri" w:cs="Calibri"/>
-          <w:color w:val="1A1A1A"/>
-        </w:rPr>
-        <w:t>To know the basics of computational complexity of various algorithms.</w:t>
+        <w:divId w:val="1128549756"/>
+        <w:rPr>
+          <w:rFonts w:ascii="Calibri" w:eastAsia="Times New Roman" w:hAnsi="Calibri" w:cs="Calibri"/>
+          <w:color w:val="1A1A1A"/>
+        </w:rPr>
+      </w:pPr>
+      <w:r>
+        <w:rPr>
+          <w:rStyle w:val="Strong"/>
+          <w:rFonts w:ascii="Calibri" w:eastAsia="Times New Roman" w:hAnsi="Calibri" w:cs="Calibri"/>
+          <w:color w:val="1A1A1A"/>
+        </w:rPr>
+        <w:t>Divide:</w:t>
+      </w:r>
+      <w:r>
+        <w:rPr>
+          <w:rFonts w:ascii="Calibri" w:eastAsia="Times New Roman" w:hAnsi="Calibri" w:cs="Calibri"/>
+          <w:color w:val="1A1A1A"/>
+        </w:rPr>
+        <w:t xml:space="preserve"> </w:t>
+      </w:r>
+      <w:r>
+        <w:rPr>
+          <w:rFonts w:ascii="Calibri" w:eastAsia="Times New Roman" w:hAnsi="Calibri" w:cs="Calibri"/>
+          <w:color w:val="1A1A1A"/>
+        </w:rPr>
+        <w:t>A pivot element is selected from the array. The choice of pivot can significantly affect performance. Common strategies include choosing the last element, the first element, a random element, or using the median-of-three method (the median of the first, middle, and last elements).</w:t>
       </w:r>
     </w:p>
     <w:p>
@@ -386,33 +501,113 @@
           <w:numId w:val="2"/>
         </w:numPr>
         <w:spacing w:before="100" w:beforeAutospacing="1" w:after="100" w:afterAutospacing="1"/>
-        <w:divId w:val="1978336600"/>
-        <w:rPr>
-          <w:rFonts w:ascii="Calibri" w:eastAsia="Times New Roman" w:hAnsi="Calibri" w:cs="Calibri"/>
-          <w:color w:val="1A1A1A"/>
-        </w:rPr>
-      </w:pPr>
-      <w:r>
-        <w:rPr>
-          <w:rFonts w:ascii="Calibri" w:eastAsia="Times New Roman" w:hAnsi="Calibri" w:cs="Calibri"/>
-          <w:color w:val="1A1A1A"/>
-        </w:rPr>
-        <w:t>To select appropriate algorithm design strategies to solve real-world problems.</w:t>
-      </w:r>
-    </w:p>
-    <w:p>
-      <w:pPr>
-        <w:pStyle w:val="Heading2"/>
-        <w:divId w:val="1978336600"/>
-        <w:rPr>
-          <w:rFonts w:ascii="Calibri" w:eastAsia="Times New Roman" w:hAnsi="Calibri" w:cs="Calibri"/>
-        </w:rPr>
-      </w:pPr>
-      <w:r>
-        <w:rPr>
-          <w:rFonts w:ascii="Calibri" w:eastAsia="Times New Roman" w:hAnsi="Calibri" w:cs="Calibri"/>
-        </w:rPr>
-        <w:t>3. Course Outcome:</w:t>
+        <w:divId w:val="1128549756"/>
+        <w:rPr>
+          <w:rFonts w:ascii="Calibri" w:eastAsia="Times New Roman" w:hAnsi="Calibri" w:cs="Calibri"/>
+          <w:color w:val="1A1A1A"/>
+        </w:rPr>
+      </w:pPr>
+      <w:r>
+        <w:rPr>
+          <w:rStyle w:val="Strong"/>
+          <w:rFonts w:ascii="Calibri" w:eastAsia="Times New Roman" w:hAnsi="Calibri" w:cs="Calibri"/>
+          <w:color w:val="1A1A1A"/>
+        </w:rPr>
+        <w:t>Partition:</w:t>
+      </w:r>
+      <w:r>
+        <w:rPr>
+          <w:rFonts w:ascii="Calibri" w:eastAsia="Times New Roman" w:hAnsi="Calibri" w:cs="Calibri"/>
+          <w:color w:val="1A1A1A"/>
+        </w:rPr>
+        <w:t xml:space="preserve"> The array is rearranged so that all elements smaller than the pivot are placed to its left and all elements larger are placed to its right. The pivot itself is placed in its correct sorted position.</w:t>
+      </w:r>
+    </w:p>
+    <w:p>
+      <w:pPr>
+        <w:numPr>
+          <w:ilvl w:val="0"/>
+          <w:numId w:val="2"/>
+        </w:numPr>
+        <w:spacing w:before="100" w:beforeAutospacing="1" w:after="100" w:afterAutospacing="1"/>
+        <w:divId w:val="1128549756"/>
+        <w:rPr>
+          <w:rFonts w:ascii="Calibri" w:eastAsia="Times New Roman" w:hAnsi="Calibri" w:cs="Calibri"/>
+          <w:color w:val="1A1A1A"/>
+        </w:rPr>
+      </w:pPr>
+      <w:r>
+        <w:rPr>
+          <w:rStyle w:val="Strong"/>
+          <w:rFonts w:ascii="Calibri" w:eastAsia="Times New Roman" w:hAnsi="Calibri" w:cs="Calibri"/>
+          <w:color w:val="1A1A1A"/>
+        </w:rPr>
+        <w:t>Conquer:</w:t>
+      </w:r>
+      <w:r>
+        <w:rPr>
+          <w:rFonts w:ascii="Calibri" w:eastAsia="Times New Roman" w:hAnsi="Calibri" w:cs="Calibri"/>
+          <w:color w:val="1A1A1A"/>
+        </w:rPr>
+        <w:t xml:space="preserve"> </w:t>
+      </w:r>
+      <w:r>
+        <w:rPr>
+          <w:rFonts w:ascii="Calibri" w:eastAsia="Times New Roman" w:hAnsi="Calibri" w:cs="Calibri"/>
+          <w:color w:val="1A1A1A"/>
+        </w:rPr>
+        <w:t>The same process is applied recursively to the left and right subarrays created by the partition step.</w:t>
+      </w:r>
+    </w:p>
+    <w:p>
+      <w:pPr>
+        <w:pStyle w:val="NormalWeb"/>
+        <w:divId w:val="1128549756"/>
+        <w:rPr>
+          <w:rFonts w:ascii="Calibri" w:hAnsi="Calibri" w:cs="Calibri"/>
+          <w:color w:val="1A1A1A"/>
+        </w:rPr>
+      </w:pPr>
+      <w:r>
+        <w:rPr>
+          <w:rFonts w:ascii="Calibri" w:hAnsi="Calibri" w:cs="Calibri"/>
+          <w:color w:val="1A1A1A"/>
+        </w:rPr>
+        <w:t>Unlike some other divide-and-conquer algorithms, Quick Sort does not require a separate combine step. Once all recursive calls complete, the array is already sorted due to the placement of pivots at each stage.</w:t>
+      </w:r>
+    </w:p>
+    <w:p>
+      <w:pPr>
+        <w:pStyle w:val="NormalWeb"/>
+        <w:divId w:val="1128549756"/>
+        <w:rPr>
+          <w:rFonts w:ascii="Calibri" w:hAnsi="Calibri" w:cs="Calibri"/>
+          <w:color w:val="1A1A1A"/>
+        </w:rPr>
+      </w:pPr>
+      <w:r>
+        <w:rPr>
+          <w:rFonts w:ascii="Calibri" w:hAnsi="Calibri" w:cs="Calibri"/>
+          <w:color w:val="1A1A1A"/>
+        </w:rPr>
+        <w:t>The efficiency of Quick Sort lies in its average-case time complexity of O(n log n), which makes it suitable for a wide range of applications. However, in the worst case—when the pivot selection is poor and the partitioning is unbalanced—its performance can degrade to O(n²). To minimize the likelihood of this scenario, several optimizations are often applied:</w:t>
+      </w:r>
+    </w:p>
+    <w:p>
+      <w:pPr>
+        <w:pStyle w:val="NormalWeb"/>
+        <w:divId w:val="1128549756"/>
+        <w:rPr>
+          <w:rFonts w:ascii="Calibri" w:hAnsi="Calibri" w:cs="Calibri"/>
+          <w:color w:val="1A1A1A"/>
+        </w:rPr>
+      </w:pPr>
+      <w:r>
+        <w:rPr>
+          <w:rFonts w:ascii="Calibri" w:hAnsi="Calibri" w:cs="Calibri"/>
+          <w:color w:val="1A1A1A"/>
+        </w:rPr>
+        <w:t>Random Pivot Selection: Choosing a random pivot reduces the chance of encountering consistently unbalanced partitions.</w:t>
       </w:r>
     </w:p>
     <w:p>
@@ -422,18 +617,33 @@
           <w:numId w:val="3"/>
         </w:numPr>
         <w:spacing w:before="100" w:beforeAutospacing="1" w:after="100" w:afterAutospacing="1"/>
-        <w:divId w:val="1978336600"/>
-        <w:rPr>
-          <w:rFonts w:ascii="Calibri" w:eastAsia="Times New Roman" w:hAnsi="Calibri" w:cs="Calibri"/>
-          <w:color w:val="1A1A1A"/>
-        </w:rPr>
-      </w:pPr>
-      <w:r>
-        <w:rPr>
-          <w:rFonts w:ascii="Calibri" w:eastAsia="Times New Roman" w:hAnsi="Calibri" w:cs="Calibri"/>
-          <w:color w:val="1A1A1A"/>
-        </w:rPr>
-        <w:t>Analyze the asymptotic performance of algorithms.</w:t>
+        <w:divId w:val="1128549756"/>
+        <w:rPr>
+          <w:rFonts w:ascii="Calibri" w:eastAsia="Times New Roman" w:hAnsi="Calibri" w:cs="Calibri"/>
+          <w:color w:val="1A1A1A"/>
+        </w:rPr>
+      </w:pPr>
+      <w:r>
+        <w:rPr>
+          <w:rStyle w:val="Strong"/>
+          <w:rFonts w:ascii="Calibri" w:eastAsia="Times New Roman" w:hAnsi="Calibri" w:cs="Calibri"/>
+          <w:color w:val="1A1A1A"/>
+        </w:rPr>
+        <w:t>Median-of-Three Method:</w:t>
+      </w:r>
+      <w:r>
+        <w:rPr>
+          <w:rFonts w:ascii="Calibri" w:eastAsia="Times New Roman" w:hAnsi="Calibri" w:cs="Calibri"/>
+          <w:color w:val="1A1A1A"/>
+        </w:rPr>
+        <w:t xml:space="preserve"> </w:t>
+      </w:r>
+      <w:r>
+        <w:rPr>
+          <w:rFonts w:ascii="Calibri" w:eastAsia="Times New Roman" w:hAnsi="Calibri" w:cs="Calibri"/>
+          <w:color w:val="1A1A1A"/>
+        </w:rPr>
+        <w:t>Using the median of the first, middle, and last elements as the pivot leads to more balanced partitions in practice.</w:t>
       </w:r>
     </w:p>
     <w:p>
@@ -443,83 +653,36 @@
           <w:numId w:val="3"/>
         </w:numPr>
         <w:spacing w:before="100" w:beforeAutospacing="1" w:after="100" w:afterAutospacing="1"/>
-        <w:divId w:val="1978336600"/>
-        <w:rPr>
-          <w:rFonts w:ascii="Calibri" w:eastAsia="Times New Roman" w:hAnsi="Calibri" w:cs="Calibri"/>
-          <w:color w:val="1A1A1A"/>
-        </w:rPr>
-      </w:pPr>
-      <w:r>
-        <w:rPr>
-          <w:rFonts w:ascii="Calibri" w:eastAsia="Times New Roman" w:hAnsi="Calibri" w:cs="Calibri"/>
-          <w:color w:val="1A1A1A"/>
-        </w:rPr>
-        <w:t>Solve computational problems by applying suitable paradigms of Divide and Conquer or Greedy methodologies.</w:t>
-      </w:r>
-    </w:p>
-    <w:p>
-      <w:pPr>
-        <w:pStyle w:val="Heading2"/>
-        <w:divId w:val="1978336600"/>
-        <w:rPr>
-          <w:rFonts w:ascii="Calibri" w:eastAsia="Times New Roman" w:hAnsi="Calibri" w:cs="Calibri"/>
-        </w:rPr>
-      </w:pPr>
-      <w:r>
-        <w:rPr>
-          <w:rFonts w:ascii="Calibri" w:eastAsia="Times New Roman" w:hAnsi="Calibri" w:cs="Calibri"/>
-        </w:rPr>
-        <w:t>4. Theory:</w:t>
-      </w:r>
-    </w:p>
-    <w:p>
-      <w:pPr>
-        <w:pStyle w:val="NormalWeb"/>
-        <w:divId w:val="1978336600"/>
-        <w:rPr>
-          <w:rFonts w:ascii="Calibri" w:hAnsi="Calibri" w:cs="Calibri"/>
-          <w:color w:val="1A1A1A"/>
-        </w:rPr>
-      </w:pPr>
-      <w:r>
-        <w:rPr>
-          <w:rFonts w:ascii="Calibri" w:hAnsi="Calibri" w:cs="Calibri"/>
-          <w:color w:val="1A1A1A"/>
-        </w:rPr>
-        <w:t xml:space="preserve">Quick Sort is an efficient, divide-and-conquer, in-place sorting algorithm. It works by selecting a 'pivot' element from the array and partitioning the other </w:t>
-      </w:r>
-      <w:r>
-        <w:rPr>
-          <w:rFonts w:ascii="Calibri" w:hAnsi="Calibri" w:cs="Calibri"/>
-          <w:color w:val="1A1A1A"/>
-        </w:rPr>
-        <w:lastRenderedPageBreak/>
-        <w:t>elements into two sub-arrays according to whether they are less than or greater than the pivot.</w:t>
-      </w:r>
-    </w:p>
-    <w:p>
-      <w:pPr>
-        <w:pStyle w:val="Heading3"/>
-        <w:divId w:val="1978336600"/>
-        <w:rPr>
-          <w:rFonts w:ascii="Calibri" w:eastAsia="Times New Roman" w:hAnsi="Calibri" w:cs="Calibri"/>
-        </w:rPr>
-      </w:pPr>
-      <w:r>
-        <w:rPr>
-          <w:rFonts w:ascii="Calibri" w:eastAsia="Times New Roman" w:hAnsi="Calibri" w:cs="Calibri"/>
-        </w:rPr>
-        <w:t>Working of Quick Sort:</w:t>
+        <w:divId w:val="1128549756"/>
+        <w:rPr>
+          <w:rFonts w:ascii="Calibri" w:eastAsia="Times New Roman" w:hAnsi="Calibri" w:cs="Calibri"/>
+          <w:color w:val="1A1A1A"/>
+        </w:rPr>
+      </w:pPr>
+      <w:r>
+        <w:rPr>
+          <w:rStyle w:val="Strong"/>
+          <w:rFonts w:ascii="Calibri" w:eastAsia="Times New Roman" w:hAnsi="Calibri" w:cs="Calibri"/>
+          <w:color w:val="1A1A1A"/>
+        </w:rPr>
+        <w:t>Tail Recursion Elimination:</w:t>
+      </w:r>
+      <w:r>
+        <w:rPr>
+          <w:rFonts w:ascii="Calibri" w:eastAsia="Times New Roman" w:hAnsi="Calibri" w:cs="Calibri"/>
+          <w:color w:val="1A1A1A"/>
+        </w:rPr>
+        <w:t xml:space="preserve"> By converting the tail-recursive calls into iterative steps, the recursion depth can be reduced, improving space efficiency.</w:t>
       </w:r>
     </w:p>
     <w:p>
       <w:pPr>
         <w:numPr>
           <w:ilvl w:val="0"/>
-          <w:numId w:val="4"/>
+          <w:numId w:val="3"/>
         </w:numPr>
         <w:spacing w:before="100" w:beforeAutospacing="1" w:after="100" w:afterAutospacing="1"/>
-        <w:divId w:val="1978336600"/>
+        <w:divId w:val="1128549756"/>
         <w:rPr>
           <w:rFonts w:ascii="Calibri" w:eastAsia="Times New Roman" w:hAnsi="Calibri" w:cs="Calibri"/>
           <w:color w:val="1A1A1A"/>
@@ -531,94 +694,29 @@
           <w:rFonts w:ascii="Calibri" w:eastAsia="Times New Roman" w:hAnsi="Calibri" w:cs="Calibri"/>
           <w:color w:val="1A1A1A"/>
         </w:rPr>
-        <w:t>Divide:</w:t>
-      </w:r>
-      <w:r>
-        <w:rPr>
-          <w:rFonts w:ascii="Calibri" w:eastAsia="Times New Roman" w:hAnsi="Calibri" w:cs="Calibri"/>
-          <w:color w:val="1A1A1A"/>
-        </w:rPr>
-        <w:t xml:space="preserve"> Select a pivot element from the array.</w:t>
-      </w:r>
-    </w:p>
-    <w:p>
-      <w:pPr>
-        <w:numPr>
-          <w:ilvl w:val="0"/>
-          <w:numId w:val="4"/>
-        </w:numPr>
-        <w:spacing w:before="100" w:beforeAutospacing="1" w:after="100" w:afterAutospacing="1"/>
-        <w:divId w:val="1978336600"/>
-        <w:rPr>
-          <w:rFonts w:ascii="Calibri" w:eastAsia="Times New Roman" w:hAnsi="Calibri" w:cs="Calibri"/>
-          <w:color w:val="1A1A1A"/>
-        </w:rPr>
-      </w:pPr>
-      <w:r>
-        <w:rPr>
-          <w:rStyle w:val="Strong"/>
-          <w:rFonts w:ascii="Calibri" w:eastAsia="Times New Roman" w:hAnsi="Calibri" w:cs="Calibri"/>
-          <w:color w:val="1A1A1A"/>
-        </w:rPr>
-        <w:t>Partition:</w:t>
-      </w:r>
-      <w:r>
-        <w:rPr>
-          <w:rFonts w:ascii="Calibri" w:eastAsia="Times New Roman" w:hAnsi="Calibri" w:cs="Calibri"/>
-          <w:color w:val="1A1A1A"/>
-        </w:rPr>
-        <w:t xml:space="preserve"> Rearrange elements so that all elements smaller than the pivot come before it, and all larger elements come after it.</w:t>
-      </w:r>
-    </w:p>
-    <w:p>
-      <w:pPr>
-        <w:numPr>
-          <w:ilvl w:val="0"/>
-          <w:numId w:val="4"/>
-        </w:numPr>
-        <w:spacing w:before="100" w:beforeAutospacing="1" w:after="100" w:afterAutospacing="1"/>
-        <w:divId w:val="1978336600"/>
-        <w:rPr>
-          <w:rFonts w:ascii="Calibri" w:eastAsia="Times New Roman" w:hAnsi="Calibri" w:cs="Calibri"/>
-          <w:color w:val="1A1A1A"/>
-        </w:rPr>
-      </w:pPr>
-      <w:r>
-        <w:rPr>
-          <w:rStyle w:val="Strong"/>
-          <w:rFonts w:ascii="Calibri" w:eastAsia="Times New Roman" w:hAnsi="Calibri" w:cs="Calibri"/>
-          <w:color w:val="1A1A1A"/>
-        </w:rPr>
-        <w:t>Conquer:</w:t>
-      </w:r>
-      <w:r>
-        <w:rPr>
-          <w:rFonts w:ascii="Calibri" w:eastAsia="Times New Roman" w:hAnsi="Calibri" w:cs="Calibri"/>
-          <w:color w:val="1A1A1A"/>
-        </w:rPr>
-        <w:t xml:space="preserve"> </w:t>
-      </w:r>
-      <w:r>
-        <w:rPr>
-          <w:rFonts w:ascii="Calibri" w:eastAsia="Times New Roman" w:hAnsi="Calibri" w:cs="Calibri"/>
-          <w:color w:val="1A1A1A"/>
-        </w:rPr>
-        <w:t>Recursively apply the above steps to the sub-arrays.</w:t>
+        <w:t>Hybrid Approach:</w:t>
+      </w:r>
+      <w:r>
+        <w:rPr>
+          <w:rFonts w:ascii="Calibri" w:eastAsia="Times New Roman" w:hAnsi="Calibri" w:cs="Calibri"/>
+          <w:color w:val="1A1A1A"/>
+        </w:rPr>
+        <w:t xml:space="preserve"> For small subarrays, switching from QuickSort to a simpler algorithm like Insertion Sort can improve performance since the overhead of recursion becomes significant for small input sizes.</w:t>
       </w:r>
     </w:p>
     <w:p>
       <w:pPr>
         <w:pStyle w:val="Heading2"/>
-        <w:divId w:val="1978336600"/>
-        <w:rPr>
-          <w:rFonts w:ascii="Calibri" w:eastAsia="Times New Roman" w:hAnsi="Calibri" w:cs="Calibri"/>
-        </w:rPr>
-      </w:pPr>
-      <w:r>
-        <w:rPr>
-          <w:rFonts w:ascii="Calibri" w:eastAsia="Times New Roman" w:hAnsi="Calibri" w:cs="Calibri"/>
-        </w:rPr>
-        <w:t>5. Time and Space Complexity:</w:t>
+        <w:divId w:val="1128549756"/>
+        <w:rPr>
+          <w:rFonts w:ascii="Calibri" w:eastAsia="Times New Roman" w:hAnsi="Calibri" w:cs="Calibri"/>
+        </w:rPr>
+      </w:pPr>
+      <w:r>
+        <w:rPr>
+          <w:rFonts w:ascii="Calibri" w:eastAsia="Times New Roman" w:hAnsi="Calibri" w:cs="Calibri"/>
+        </w:rPr>
+        <w:t>5. Time and Space Complexity</w:t>
       </w:r>
     </w:p>
     <w:tbl>
@@ -639,7 +737,7 @@
       </w:tblGrid>
       <w:tr>
         <w:trPr>
-          <w:divId w:val="1978336600"/>
+          <w:divId w:val="1128549756"/>
         </w:trPr>
         <w:tc>
           <w:tcPr>
@@ -677,6 +775,7 @@
                 <w:bCs/>
                 <w:color w:val="FFFFFF"/>
               </w:rPr>
+              <w:lastRenderedPageBreak/>
               <w:t>Case</w:t>
             </w:r>
           </w:p>
@@ -764,7 +863,7 @@
       </w:tr>
       <w:tr>
         <w:trPr>
-          <w:divId w:val="1978336600"/>
+          <w:divId w:val="1128549756"/>
         </w:trPr>
         <w:tc>
           <w:tcPr>
@@ -874,7 +973,7 @@
       </w:tr>
       <w:tr>
         <w:trPr>
-          <w:divId w:val="1978336600"/>
+          <w:divId w:val="1128549756"/>
         </w:trPr>
         <w:tc>
           <w:tcPr>
@@ -984,7 +1083,7 @@
       </w:tr>
       <w:tr>
         <w:trPr>
-          <w:divId w:val="1978336600"/>
+          <w:divId w:val="1128549756"/>
         </w:trPr>
         <w:tc>
           <w:tcPr>
@@ -1052,22 +1151,7 @@
                 <w:rFonts w:ascii="Calibri" w:eastAsia="Times New Roman" w:hAnsi="Calibri" w:cs="Calibri"/>
                 <w:color w:val="1A1A1A"/>
               </w:rPr>
-              <w:t>O(n</w:t>
-            </w:r>
-            <w:r>
-              <w:rPr>
-                <w:rFonts w:ascii="Calibri" w:eastAsia="Times New Roman" w:hAnsi="Calibri" w:cs="Calibri"/>
-                <w:color w:val="1A1A1A"/>
-                <w:vertAlign w:val="superscript"/>
-              </w:rPr>
-              <w:t>2</w:t>
-            </w:r>
-            <w:r>
-              <w:rPr>
-                <w:rFonts w:ascii="Calibri" w:eastAsia="Times New Roman" w:hAnsi="Calibri" w:cs="Calibri"/>
-                <w:color w:val="1A1A1A"/>
-              </w:rPr>
-              <w:t>)</w:t>
+              <w:t>O(n²)</w:t>
             </w:r>
           </w:p>
         </w:tc>
@@ -1109,7 +1193,7 @@
       </w:tr>
       <w:tr>
         <w:trPr>
-          <w:divId w:val="1978336600"/>
+          <w:divId w:val="1128549756"/>
         </w:trPr>
         <w:tc>
           <w:tcPr>
@@ -1221,678 +1305,1952 @@
     <w:p>
       <w:pPr>
         <w:pStyle w:val="Heading2"/>
-        <w:divId w:val="1978336600"/>
-        <w:rPr>
-          <w:rFonts w:ascii="Calibri" w:eastAsia="Times New Roman" w:hAnsi="Calibri" w:cs="Calibri"/>
-        </w:rPr>
-      </w:pPr>
-      <w:r>
-        <w:rPr>
-          <w:rFonts w:ascii="Calibri" w:eastAsia="Times New Roman" w:hAnsi="Calibri" w:cs="Calibri"/>
-        </w:rPr>
-        <w:t>6. Algorithm &amp; Pseudocode:</w:t>
-      </w:r>
-    </w:p>
-    <w:p>
-      <w:pPr>
-        <w:pStyle w:val="HTMLPreformatted"/>
-        <w:divId w:val="1978336600"/>
-        <w:rPr>
-          <w:color w:val="1A1A1A"/>
-        </w:rPr>
-      </w:pPr>
-    </w:p>
-    <w:p>
-      <w:pPr>
-        <w:pStyle w:val="HTMLPreformatted"/>
-        <w:divId w:val="1978336600"/>
-        <w:rPr>
-          <w:color w:val="1A1A1A"/>
-        </w:rPr>
-      </w:pPr>
-      <w:r>
-        <w:rPr>
-          <w:color w:val="1A1A1A"/>
-        </w:rPr>
-        <w:t>ALGORITHM QuickSort(arr, low, high)</w:t>
-      </w:r>
-    </w:p>
-    <w:p>
-      <w:pPr>
-        <w:pStyle w:val="HTMLPreformatted"/>
-        <w:divId w:val="1978336600"/>
-        <w:rPr>
-          <w:color w:val="1A1A1A"/>
-        </w:rPr>
-      </w:pPr>
-      <w:r>
-        <w:rPr>
-          <w:color w:val="1A1A1A"/>
-        </w:rPr>
-        <w:t>1. if low &lt; high then</w:t>
-      </w:r>
-    </w:p>
-    <w:p>
-      <w:pPr>
-        <w:pStyle w:val="HTMLPreformatted"/>
-        <w:divId w:val="1978336600"/>
-        <w:rPr>
-          <w:color w:val="1A1A1A"/>
-        </w:rPr>
-      </w:pPr>
-      <w:r>
-        <w:rPr>
-          <w:color w:val="1A1A1A"/>
-        </w:rPr>
-        <w:t>2.     pivotIndex ← Partition(arr, low, high)</w:t>
-      </w:r>
-    </w:p>
-    <w:p>
-      <w:pPr>
-        <w:pStyle w:val="HTMLPreformatted"/>
-        <w:divId w:val="1978336600"/>
-        <w:rPr>
-          <w:color w:val="1A1A1A"/>
-        </w:rPr>
-      </w:pPr>
-      <w:r>
-        <w:rPr>
-          <w:color w:val="1A1A1A"/>
-        </w:rPr>
-        <w:t>3.     QuickSort(arr, low, pivotIndex - 1)</w:t>
-      </w:r>
-    </w:p>
-    <w:p>
-      <w:pPr>
-        <w:pStyle w:val="HTMLPreformatted"/>
-        <w:divId w:val="1978336600"/>
-        <w:rPr>
-          <w:color w:val="1A1A1A"/>
-        </w:rPr>
-      </w:pPr>
-      <w:r>
-        <w:rPr>
-          <w:color w:val="1A1A1A"/>
-        </w:rPr>
-        <w:t xml:space="preserve">4.     </w:t>
-      </w:r>
-      <w:r>
-        <w:rPr>
-          <w:color w:val="1A1A1A"/>
-        </w:rPr>
-        <w:t>QuickSort(arr, pivotIndex + 1, high)</w:t>
-      </w:r>
-    </w:p>
-    <w:p>
-      <w:pPr>
-        <w:pStyle w:val="HTMLPreformatted"/>
-        <w:divId w:val="1978336600"/>
-        <w:rPr>
-          <w:color w:val="1A1A1A"/>
-        </w:rPr>
-      </w:pPr>
-      <w:r>
-        <w:rPr>
-          <w:color w:val="1A1A1A"/>
-        </w:rPr>
-        <w:t>5. end if</w:t>
-      </w:r>
-    </w:p>
-    <w:p>
-      <w:pPr>
-        <w:pStyle w:val="HTMLPreformatted"/>
-        <w:divId w:val="1978336600"/>
-        <w:rPr>
-          <w:color w:val="1A1A1A"/>
-        </w:rPr>
-      </w:pPr>
-      <w:r>
-        <w:rPr>
-          <w:color w:val="1A1A1A"/>
-        </w:rPr>
-        <w:t>END ALGORITHM</w:t>
-      </w:r>
-    </w:p>
-    <w:p>
-      <w:pPr>
-        <w:pStyle w:val="HTMLPreformatted"/>
-        <w:divId w:val="1978336600"/>
-        <w:rPr>
-          <w:color w:val="1A1A1A"/>
-        </w:rPr>
-      </w:pPr>
-    </w:p>
-    <w:p>
-      <w:pPr>
-        <w:pStyle w:val="HTMLPreformatted"/>
-        <w:divId w:val="1978336600"/>
-        <w:rPr>
-          <w:color w:val="1A1A1A"/>
-        </w:rPr>
-      </w:pPr>
-      <w:r>
-        <w:rPr>
-          <w:color w:val="1A1A1A"/>
-        </w:rPr>
-        <w:t>ALGORITHM Partition(arr, low, high)</w:t>
-      </w:r>
-    </w:p>
-    <w:p>
-      <w:pPr>
-        <w:pStyle w:val="HTMLPreformatted"/>
-        <w:divId w:val="1978336600"/>
-        <w:rPr>
-          <w:color w:val="1A1A1A"/>
-        </w:rPr>
-      </w:pPr>
-      <w:r>
-        <w:rPr>
-          <w:color w:val="1A1A1A"/>
-        </w:rPr>
-        <w:t>1. pivot ← arr[high]</w:t>
-      </w:r>
-    </w:p>
-    <w:p>
-      <w:pPr>
-        <w:pStyle w:val="HTMLPreformatted"/>
-        <w:divId w:val="1978336600"/>
-        <w:rPr>
-          <w:color w:val="1A1A1A"/>
-        </w:rPr>
-      </w:pPr>
-      <w:r>
-        <w:rPr>
-          <w:color w:val="1A1A1A"/>
-        </w:rPr>
-        <w:t>2. i ← low - 1</w:t>
-      </w:r>
-    </w:p>
-    <w:p>
-      <w:pPr>
-        <w:pStyle w:val="HTMLPreformatted"/>
-        <w:divId w:val="1978336600"/>
-        <w:rPr>
-          <w:color w:val="1A1A1A"/>
-        </w:rPr>
-      </w:pPr>
-      <w:r>
-        <w:rPr>
-          <w:color w:val="1A1A1A"/>
-        </w:rPr>
-        <w:t>3. for j ← low to high - 1 do</w:t>
-      </w:r>
-    </w:p>
-    <w:p>
-      <w:pPr>
-        <w:pStyle w:val="HTMLPreformatted"/>
-        <w:divId w:val="1978336600"/>
-        <w:rPr>
-          <w:color w:val="1A1A1A"/>
-        </w:rPr>
-      </w:pPr>
-      <w:r>
-        <w:rPr>
-          <w:color w:val="1A1A1A"/>
-        </w:rPr>
-        <w:t>4.     if arr[j] ≤ pivot then</w:t>
-      </w:r>
-    </w:p>
-    <w:p>
-      <w:pPr>
-        <w:pStyle w:val="HTMLPreformatted"/>
-        <w:divId w:val="1978336600"/>
-        <w:rPr>
-          <w:color w:val="1A1A1A"/>
-        </w:rPr>
-      </w:pPr>
-      <w:r>
-        <w:rPr>
-          <w:color w:val="1A1A1A"/>
-        </w:rPr>
-        <w:t>5.         i ← i + 1</w:t>
-      </w:r>
-    </w:p>
-    <w:p>
-      <w:pPr>
-        <w:pStyle w:val="HTMLPreformatted"/>
-        <w:divId w:val="1978336600"/>
-        <w:rPr>
-          <w:color w:val="1A1A1A"/>
-        </w:rPr>
-      </w:pPr>
-      <w:r>
-        <w:rPr>
-          <w:color w:val="1A1A1A"/>
-        </w:rPr>
-        <w:lastRenderedPageBreak/>
-        <w:t>6.         SWAP(arr[i], arr[j])</w:t>
-      </w:r>
-    </w:p>
-    <w:p>
-      <w:pPr>
-        <w:pStyle w:val="HTMLPreformatted"/>
-        <w:divId w:val="1978336600"/>
-        <w:rPr>
-          <w:color w:val="1A1A1A"/>
-        </w:rPr>
-      </w:pPr>
-      <w:r>
-        <w:rPr>
-          <w:color w:val="1A1A1A"/>
-        </w:rPr>
-        <w:t>7.     end if</w:t>
-      </w:r>
-    </w:p>
-    <w:p>
-      <w:pPr>
-        <w:pStyle w:val="HTMLPreformatted"/>
-        <w:ind w:left="600" w:right="600"/>
-        <w:divId w:val="1978336600"/>
-        <w:rPr>
-          <w:color w:val="1A1A1A"/>
-        </w:rPr>
-      </w:pPr>
-      <w:r>
-        <w:rPr>
-          <w:color w:val="1A1A1A"/>
-        </w:rPr>
-        <w:t>8. end for</w:t>
-      </w:r>
-    </w:p>
-    <w:p>
-      <w:pPr>
-        <w:pStyle w:val="HTMLPreformatted"/>
-        <w:ind w:left="600" w:right="600"/>
-        <w:divId w:val="1978336600"/>
-        <w:rPr>
-          <w:color w:val="1A1A1A"/>
-        </w:rPr>
-      </w:pPr>
-      <w:r>
-        <w:rPr>
-          <w:color w:val="1A1A1A"/>
-        </w:rPr>
-        <w:t>9. SWAP(arr[i + 1], arr[high])</w:t>
-      </w:r>
-    </w:p>
-    <w:p>
-      <w:pPr>
-        <w:pStyle w:val="HTMLPreformatted"/>
-        <w:ind w:left="600" w:right="600"/>
-        <w:divId w:val="1978336600"/>
-        <w:rPr>
-          <w:color w:val="1A1A1A"/>
-        </w:rPr>
-      </w:pPr>
-      <w:r>
-        <w:rPr>
-          <w:color w:val="1A1A1A"/>
-        </w:rPr>
-        <w:t>10. return (i + 1)</w:t>
-      </w:r>
-    </w:p>
-    <w:p>
-      <w:pPr>
-        <w:pStyle w:val="HTMLPreformatted"/>
-        <w:ind w:left="600" w:right="600"/>
-        <w:divId w:val="1978336600"/>
-        <w:rPr>
-          <w:color w:val="1A1A1A"/>
-        </w:rPr>
-      </w:pPr>
-      <w:r>
-        <w:rPr>
-          <w:color w:val="1A1A1A"/>
-        </w:rPr>
-        <w:t>END ALGORITHM</w:t>
+        <w:ind w:left="600" w:right="600"/>
+        <w:divId w:val="1128549756"/>
+        <w:rPr>
+          <w:rFonts w:ascii="Calibri" w:eastAsia="Times New Roman" w:hAnsi="Calibri" w:cs="Calibri"/>
+        </w:rPr>
+      </w:pPr>
+      <w:r>
+        <w:rPr>
+          <w:rFonts w:ascii="Calibri" w:eastAsia="Times New Roman" w:hAnsi="Calibri" w:cs="Calibri"/>
+        </w:rPr>
+        <w:t>Quick Sort Algorithm</w:t>
+      </w:r>
+    </w:p>
+    <w:p>
+      <w:pPr>
+        <w:pStyle w:val="NormalWeb"/>
+        <w:ind w:left="600" w:right="600"/>
+        <w:divId w:val="1128549756"/>
+        <w:rPr>
+          <w:rFonts w:ascii="Calibri" w:hAnsi="Calibri" w:cs="Calibri"/>
+          <w:color w:val="1A1A1A"/>
+        </w:rPr>
+      </w:pPr>
+      <w:r>
+        <w:rPr>
+          <w:rFonts w:ascii="Calibri" w:hAnsi="Calibri" w:cs="Calibri"/>
+          <w:color w:val="1A1A1A"/>
+        </w:rPr>
+        <w:t>i. Start with an unsorted array.</w:t>
+      </w:r>
+      <w:r>
+        <w:rPr>
+          <w:rFonts w:ascii="Calibri" w:hAnsi="Calibri" w:cs="Calibri"/>
+          <w:color w:val="1A1A1A"/>
+        </w:rPr>
+        <w:br/>
+        <w:t>ii. Choose a pivot element (last element, first element, random, or median-of-three).</w:t>
+      </w:r>
+      <w:r>
+        <w:rPr>
+          <w:rFonts w:ascii="Calibri" w:hAnsi="Calibri" w:cs="Calibri"/>
+          <w:color w:val="1A1A1A"/>
+        </w:rPr>
+        <w:br/>
+        <w:t>iii. Partition the array so that:</w:t>
+      </w:r>
+      <w:r>
+        <w:rPr>
+          <w:rFonts w:ascii="Calibri" w:hAnsi="Calibri" w:cs="Calibri"/>
+          <w:color w:val="1A1A1A"/>
+        </w:rPr>
+        <w:br/>
+        <w:t>iv. All elements smaller than the pivot are placed before it.</w:t>
+      </w:r>
+      <w:r>
+        <w:rPr>
+          <w:rFonts w:ascii="Calibri" w:hAnsi="Calibri" w:cs="Calibri"/>
+          <w:color w:val="1A1A1A"/>
+        </w:rPr>
+        <w:br/>
+      </w:r>
+      <w:r>
+        <w:rPr>
+          <w:rFonts w:ascii="Calibri" w:hAnsi="Calibri" w:cs="Calibri"/>
+          <w:color w:val="1A1A1A"/>
+        </w:rPr>
+        <w:t>v. All elements greater than the pivot are placed after it.</w:t>
+      </w:r>
+      <w:r>
+        <w:rPr>
+          <w:rFonts w:ascii="Calibri" w:hAnsi="Calibri" w:cs="Calibri"/>
+          <w:color w:val="1A1A1A"/>
+        </w:rPr>
+        <w:br/>
+        <w:t>vi. Place the pivot in its correct sorted position.</w:t>
+      </w:r>
+      <w:r>
+        <w:rPr>
+          <w:rFonts w:ascii="Calibri" w:hAnsi="Calibri" w:cs="Calibri"/>
+          <w:color w:val="1A1A1A"/>
+        </w:rPr>
+        <w:br/>
+        <w:t>vii. Recursively apply QuickSort on the left subarray and right subarray.</w:t>
+      </w:r>
+      <w:r>
+        <w:rPr>
+          <w:rFonts w:ascii="Calibri" w:hAnsi="Calibri" w:cs="Calibri"/>
+          <w:color w:val="1A1A1A"/>
+        </w:rPr>
+        <w:br/>
+        <w:t>viii. Continue until subarrays have size 0 or 1 (base case).</w:t>
+      </w:r>
+      <w:r>
+        <w:rPr>
+          <w:rFonts w:ascii="Calibri" w:hAnsi="Calibri" w:cs="Calibri"/>
+          <w:color w:val="1A1A1A"/>
+        </w:rPr>
+        <w:br/>
+        <w:t>ix. End when the entire array is sorted.</w:t>
       </w:r>
     </w:p>
     <w:p>
       <w:pPr>
         <w:pStyle w:val="Heading2"/>
         <w:ind w:left="600" w:right="600"/>
-        <w:divId w:val="1978336600"/>
-        <w:rPr>
-          <w:rFonts w:ascii="Calibri" w:eastAsia="Times New Roman" w:hAnsi="Calibri" w:cs="Calibri"/>
-        </w:rPr>
-      </w:pPr>
-      <w:r>
-        <w:rPr>
-          <w:rFonts w:ascii="Calibri" w:eastAsia="Times New Roman" w:hAnsi="Calibri" w:cs="Calibri"/>
-        </w:rPr>
-        <w:t>7. Output (Movies Sorted by IMDb Rating):</w:t>
-      </w:r>
-    </w:p>
-    <w:p>
-      <w:pPr>
-        <w:pStyle w:val="HTMLPreformatted"/>
-        <w:ind w:left="600" w:right="600"/>
-        <w:divId w:val="1978336600"/>
-        <w:rPr>
-          <w:color w:val="1A1A1A"/>
-        </w:rPr>
-      </w:pPr>
-    </w:p>
-    <w:p>
-      <w:pPr>
-        <w:pStyle w:val="HTMLPreformatted"/>
-        <w:ind w:left="600" w:right="600"/>
-        <w:divId w:val="1978336600"/>
-        <w:rPr>
-          <w:color w:val="1A1A1A"/>
-        </w:rPr>
-      </w:pPr>
-      <w:r>
-        <w:rPr>
-          <w:color w:val="1A1A1A"/>
-        </w:rPr>
-        <w:t>Movies Sorted by IMDb Rating using Quick Sort:</w:t>
-      </w:r>
-    </w:p>
-    <w:p>
-      <w:pPr>
-        <w:pStyle w:val="HTMLPreformatted"/>
-        <w:ind w:left="600" w:right="600"/>
-        <w:divId w:val="1978336600"/>
-        <w:rPr>
-          <w:color w:val="1A1A1A"/>
-        </w:rPr>
-      </w:pPr>
-      <w:r>
-        <w:rPr>
-          <w:color w:val="1A1A1A"/>
-        </w:rPr>
-        <w:t>------------------------------------------------------------------------</w:t>
-      </w:r>
-    </w:p>
-    <w:p>
-      <w:pPr>
-        <w:pStyle w:val="HTMLPreformatted"/>
-        <w:ind w:left="600" w:right="600"/>
-        <w:divId w:val="1978336600"/>
-        <w:rPr>
-          <w:color w:val="1A1A1A"/>
-        </w:rPr>
-      </w:pPr>
-      <w:r>
-        <w:rPr>
-          <w:color w:val="1A1A1A"/>
-        </w:rPr>
-        <w:t xml:space="preserve">ID        </w:t>
-      </w:r>
-      <w:r>
-        <w:rPr>
-          <w:color w:val="1A1A1A"/>
-        </w:rPr>
-        <w:t>Title                       Rating    Year    Genre</w:t>
-      </w:r>
-    </w:p>
-    <w:p>
-      <w:pPr>
-        <w:pStyle w:val="HTMLPreformatted"/>
-        <w:ind w:left="600" w:right="600"/>
-        <w:divId w:val="1978336600"/>
-        <w:rPr>
-          <w:color w:val="1A1A1A"/>
-        </w:rPr>
-      </w:pPr>
-      <w:r>
-        <w:rPr>
-          <w:color w:val="1A1A1A"/>
-        </w:rPr>
-        <w:t>------------------------------------------------------------------------</w:t>
-      </w:r>
-    </w:p>
-    <w:p>
-      <w:pPr>
-        <w:pStyle w:val="HTMLPreformatted"/>
-        <w:ind w:left="600" w:right="600"/>
-        <w:divId w:val="1978336600"/>
-        <w:rPr>
-          <w:color w:val="1A1A1A"/>
-        </w:rPr>
-      </w:pPr>
-      <w:r>
-        <w:rPr>
-          <w:color w:val="1A1A1A"/>
-        </w:rPr>
-        <w:t>MOV207    Fast &amp; Furious 9            6.5       2021    Action</w:t>
-      </w:r>
-    </w:p>
-    <w:p>
-      <w:pPr>
-        <w:pStyle w:val="HTMLPreformatted"/>
-        <w:ind w:left="600" w:right="600"/>
-        <w:divId w:val="1978336600"/>
-        <w:rPr>
-          <w:color w:val="1A1A1A"/>
-        </w:rPr>
-      </w:pPr>
-      <w:r>
-        <w:rPr>
-          <w:color w:val="1A1A1A"/>
-        </w:rPr>
-        <w:t>MOV208    Red Notice                  7.3       2021    Action/Comedy</w:t>
-      </w:r>
-    </w:p>
-    <w:p>
-      <w:pPr>
-        <w:pStyle w:val="HTMLPreformatted"/>
-        <w:ind w:left="600" w:right="600"/>
-        <w:divId w:val="1978336600"/>
-        <w:rPr>
-          <w:color w:val="1A1A1A"/>
-        </w:rPr>
-      </w:pPr>
-      <w:r>
-        <w:rPr>
-          <w:color w:val="1A1A1A"/>
-        </w:rPr>
-        <w:t>MOV209    Avatar: The Way of Water    7.6       2022    Sci-Fi/Action</w:t>
-      </w:r>
-    </w:p>
-    <w:p>
-      <w:pPr>
-        <w:pStyle w:val="HTMLPreformatted"/>
-        <w:ind w:left="600" w:right="600"/>
-        <w:divId w:val="1978336600"/>
-        <w:rPr>
-          <w:color w:val="1A1A1A"/>
-        </w:rPr>
-      </w:pPr>
-      <w:r>
-        <w:rPr>
-          <w:color w:val="1A1A1A"/>
-        </w:rPr>
-        <w:t>MOV205    Parasite                    8.5       2019    Thriller/Drama</w:t>
-      </w:r>
-    </w:p>
-    <w:p>
-      <w:pPr>
-        <w:pStyle w:val="HTMLPreformatted"/>
-        <w:ind w:left="600" w:right="600"/>
-        <w:divId w:val="1978336600"/>
-        <w:rPr>
-          <w:color w:val="1A1A1A"/>
-        </w:rPr>
-      </w:pPr>
-      <w:r>
-        <w:rPr>
-          <w:color w:val="1A1A1A"/>
-        </w:rPr>
-        <w:t>MOV210    Spirited Away               8.6       2001    Animation/Fantasy</w:t>
-      </w:r>
-    </w:p>
-    <w:p>
-      <w:pPr>
-        <w:pStyle w:val="HTMLPreformatted"/>
-        <w:ind w:left="600" w:right="600"/>
-        <w:divId w:val="1978336600"/>
-        <w:rPr>
-          <w:color w:val="1A1A1A"/>
-        </w:rPr>
-      </w:pPr>
-      <w:r>
-        <w:rPr>
-          <w:color w:val="1A1A1A"/>
-        </w:rPr>
-        <w:t xml:space="preserve">MOV202    Inception                   </w:t>
-      </w:r>
-      <w:r>
-        <w:rPr>
-          <w:color w:val="1A1A1A"/>
-        </w:rPr>
-        <w:t>8.7       2010    Sci-Fi/Action</w:t>
-      </w:r>
-    </w:p>
-    <w:p>
-      <w:pPr>
-        <w:pStyle w:val="HTMLPreformatted"/>
-        <w:ind w:left="600" w:right="600"/>
-        <w:divId w:val="1978336600"/>
-        <w:rPr>
-          <w:color w:val="1A1A1A"/>
-        </w:rPr>
-      </w:pPr>
-      <w:r>
-        <w:rPr>
-          <w:color w:val="1A1A1A"/>
-        </w:rPr>
-        <w:t>MOV203    Interstellar                8.7       2014    Sci-Fi/Drama</w:t>
-      </w:r>
-    </w:p>
-    <w:p>
-      <w:pPr>
-        <w:pStyle w:val="HTMLPreformatted"/>
-        <w:ind w:left="600" w:right="600"/>
-        <w:divId w:val="1978336600"/>
-        <w:rPr>
-          <w:color w:val="1A1A1A"/>
-        </w:rPr>
-      </w:pPr>
-      <w:r>
-        <w:rPr>
-          <w:color w:val="1A1A1A"/>
-        </w:rPr>
-        <w:t>MOV204    The Matrix                  8.7       1999    Sci-Fi/Action</w:t>
-      </w:r>
-    </w:p>
-    <w:p>
-      <w:pPr>
-        <w:pStyle w:val="HTMLPreformatted"/>
-        <w:ind w:left="600" w:right="600"/>
-        <w:divId w:val="1978336600"/>
-        <w:rPr>
-          <w:color w:val="1A1A1A"/>
-        </w:rPr>
-      </w:pPr>
-      <w:r>
-        <w:rPr>
-          <w:color w:val="1A1A1A"/>
-        </w:rPr>
-        <w:t>MOV201    The Dark Knight             9.0       2008    Action/Crime</w:t>
-      </w:r>
-    </w:p>
-    <w:p>
-      <w:pPr>
-        <w:pStyle w:val="HTMLPreformatted"/>
-        <w:ind w:left="600" w:right="600"/>
-        <w:divId w:val="1978336600"/>
-        <w:rPr>
-          <w:color w:val="1A1A1A"/>
-        </w:rPr>
-      </w:pPr>
-      <w:r>
-        <w:rPr>
-          <w:color w:val="1A1A1A"/>
-        </w:rPr>
-        <w:t>MOV206    The Shawshank Redemption    9.3       1994    Drama</w:t>
-      </w:r>
-    </w:p>
-    <w:p>
-      <w:pPr>
-        <w:pStyle w:val="HTMLPreformatted"/>
-        <w:ind w:left="600" w:right="600"/>
-        <w:divId w:val="1978336600"/>
-        <w:rPr>
-          <w:color w:val="1A1A1A"/>
-        </w:rPr>
-      </w:pPr>
-      <w:r>
-        <w:rPr>
-          <w:color w:val="1A1A1A"/>
-        </w:rPr>
-        <w:t>------------------------------------------------------------------------</w:t>
+        <w:divId w:val="1128549756"/>
+        <w:rPr>
+          <w:rFonts w:ascii="Calibri" w:eastAsia="Times New Roman" w:hAnsi="Calibri" w:cs="Calibri"/>
+        </w:rPr>
+      </w:pPr>
+      <w:r>
+        <w:rPr>
+          <w:rFonts w:ascii="Calibri" w:eastAsia="Times New Roman" w:hAnsi="Calibri" w:cs="Calibri"/>
+        </w:rPr>
+        <w:t>Pseudo Code for Quick Sort</w:t>
+      </w:r>
+    </w:p>
+    <w:p>
+      <w:pPr>
+        <w:pStyle w:val="HTMLPreformatted"/>
+        <w:ind w:left="600" w:right="600"/>
+        <w:divId w:val="1128549756"/>
+        <w:rPr>
+          <w:color w:val="1A1A1A"/>
+        </w:rPr>
+      </w:pPr>
+    </w:p>
+    <w:p>
+      <w:pPr>
+        <w:pStyle w:val="HTMLPreformatted"/>
+        <w:ind w:left="600" w:right="600"/>
+        <w:divId w:val="1128549756"/>
+        <w:rPr>
+          <w:color w:val="1A1A1A"/>
+        </w:rPr>
+      </w:pPr>
+      <w:r>
+        <w:rPr>
+          <w:color w:val="1A1A1A"/>
+        </w:rPr>
+        <w:t>Procedure QUICK_SORT(arr, low, high):</w:t>
+      </w:r>
+    </w:p>
+    <w:p>
+      <w:pPr>
+        <w:pStyle w:val="HTMLPreformatted"/>
+        <w:ind w:left="600" w:right="600"/>
+        <w:divId w:val="1128549756"/>
+        <w:rPr>
+          <w:color w:val="1A1A1A"/>
+        </w:rPr>
+      </w:pPr>
+      <w:r>
+        <w:rPr>
+          <w:color w:val="1A1A1A"/>
+        </w:rPr>
+        <w:t>if low &lt; high then</w:t>
+      </w:r>
+    </w:p>
+    <w:p>
+      <w:pPr>
+        <w:pStyle w:val="HTMLPreformatted"/>
+        <w:ind w:left="600" w:right="600"/>
+        <w:divId w:val="1128549756"/>
+        <w:rPr>
+          <w:color w:val="1A1A1A"/>
+        </w:rPr>
+      </w:pPr>
+      <w:r>
+        <w:rPr>
+          <w:color w:val="1A1A1A"/>
+        </w:rPr>
+        <w:t xml:space="preserve">    pivotIndex </w:t>
+      </w:r>
+      <w:r>
+        <w:rPr>
+          <w:color w:val="1A1A1A"/>
+        </w:rPr>
+        <w:t>←</w:t>
+      </w:r>
+      <w:r>
+        <w:rPr>
+          <w:color w:val="1A1A1A"/>
+        </w:rPr>
+        <w:t xml:space="preserve"> PARTITION(arr, low, high)</w:t>
+      </w:r>
+    </w:p>
+    <w:p>
+      <w:pPr>
+        <w:pStyle w:val="HTMLPreformatted"/>
+        <w:ind w:left="600" w:right="600"/>
+        <w:divId w:val="1128549756"/>
+        <w:rPr>
+          <w:color w:val="1A1A1A"/>
+        </w:rPr>
+      </w:pPr>
+      <w:r>
+        <w:rPr>
+          <w:color w:val="1A1A1A"/>
+        </w:rPr>
+        <w:t xml:space="preserve">    // Recursively sort elements before and after partition</w:t>
+      </w:r>
+    </w:p>
+    <w:p>
+      <w:pPr>
+        <w:pStyle w:val="HTMLPreformatted"/>
+        <w:ind w:left="600" w:right="600"/>
+        <w:divId w:val="1128549756"/>
+        <w:rPr>
+          <w:color w:val="1A1A1A"/>
+        </w:rPr>
+      </w:pPr>
+      <w:r>
+        <w:rPr>
+          <w:color w:val="1A1A1A"/>
+        </w:rPr>
+        <w:t xml:space="preserve">    </w:t>
+      </w:r>
+      <w:r>
+        <w:rPr>
+          <w:color w:val="1A1A1A"/>
+        </w:rPr>
+        <w:t>QUICK_SORT(arr, low, pivotIndex - 1)</w:t>
+      </w:r>
+    </w:p>
+    <w:p>
+      <w:pPr>
+        <w:pStyle w:val="HTMLPreformatted"/>
+        <w:ind w:left="600" w:right="600"/>
+        <w:divId w:val="1128549756"/>
+        <w:rPr>
+          <w:color w:val="1A1A1A"/>
+        </w:rPr>
+      </w:pPr>
+      <w:r>
+        <w:rPr>
+          <w:color w:val="1A1A1A"/>
+        </w:rPr>
+        <w:t xml:space="preserve">    QUICK_SORT(arr, pivotIndex + 1, high)</w:t>
+      </w:r>
+    </w:p>
+    <w:p>
+      <w:pPr>
+        <w:pStyle w:val="HTMLPreformatted"/>
+        <w:ind w:left="600" w:right="600"/>
+        <w:divId w:val="1128549756"/>
+        <w:rPr>
+          <w:color w:val="1A1A1A"/>
+        </w:rPr>
+      </w:pPr>
+      <w:r>
+        <w:rPr>
+          <w:color w:val="1A1A1A"/>
+        </w:rPr>
+        <w:t>end if</w:t>
+      </w:r>
+    </w:p>
+    <w:p>
+      <w:pPr>
+        <w:pStyle w:val="HTMLPreformatted"/>
+        <w:ind w:left="600" w:right="600"/>
+        <w:divId w:val="1128549756"/>
+        <w:rPr>
+          <w:color w:val="1A1A1A"/>
+        </w:rPr>
+      </w:pPr>
+      <w:r>
+        <w:rPr>
+          <w:color w:val="1A1A1A"/>
+        </w:rPr>
+        <w:t>End Procedure</w:t>
+      </w:r>
+    </w:p>
+    <w:p>
+      <w:pPr>
+        <w:pStyle w:val="HTMLPreformatted"/>
+        <w:ind w:left="600" w:right="600"/>
+        <w:divId w:val="1128549756"/>
+        <w:rPr>
+          <w:color w:val="1A1A1A"/>
+        </w:rPr>
+      </w:pPr>
+    </w:p>
+    <w:p>
+      <w:pPr>
+        <w:pStyle w:val="HTMLPreformatted"/>
+        <w:ind w:left="600" w:right="600"/>
+        <w:divId w:val="1128549756"/>
+        <w:rPr>
+          <w:color w:val="1A1A1A"/>
+        </w:rPr>
+      </w:pPr>
+      <w:r>
+        <w:rPr>
+          <w:color w:val="1A1A1A"/>
+        </w:rPr>
+        <w:t>Procedure PARTITION(arr, low, high):</w:t>
+      </w:r>
+    </w:p>
+    <w:p>
+      <w:pPr>
+        <w:pStyle w:val="HTMLPreformatted"/>
+        <w:ind w:left="600" w:right="600"/>
+        <w:divId w:val="1128549756"/>
+        <w:rPr>
+          <w:color w:val="1A1A1A"/>
+        </w:rPr>
+      </w:pPr>
+      <w:r>
+        <w:rPr>
+          <w:color w:val="1A1A1A"/>
+        </w:rPr>
+        <w:t xml:space="preserve">pivot </w:t>
+      </w:r>
+      <w:r>
+        <w:rPr>
+          <w:color w:val="1A1A1A"/>
+        </w:rPr>
+        <w:t>←</w:t>
+      </w:r>
+      <w:r>
+        <w:rPr>
+          <w:color w:val="1A1A1A"/>
+        </w:rPr>
+        <w:t xml:space="preserve"> arr[high] // choose last element as pivot</w:t>
+      </w:r>
+    </w:p>
+    <w:p>
+      <w:pPr>
+        <w:pStyle w:val="HTMLPreformatted"/>
+        <w:ind w:left="600" w:right="600"/>
+        <w:divId w:val="1128549756"/>
+        <w:rPr>
+          <w:color w:val="1A1A1A"/>
+        </w:rPr>
+      </w:pPr>
+      <w:r>
+        <w:rPr>
+          <w:color w:val="1A1A1A"/>
+        </w:rPr>
+        <w:t xml:space="preserve">i </w:t>
+      </w:r>
+      <w:r>
+        <w:rPr>
+          <w:color w:val="1A1A1A"/>
+        </w:rPr>
+        <w:t>←</w:t>
+      </w:r>
+      <w:r>
+        <w:rPr>
+          <w:color w:val="1A1A1A"/>
+        </w:rPr>
+        <w:t xml:space="preserve"> low - 1 // index of smaller element</w:t>
+      </w:r>
+    </w:p>
+    <w:p>
+      <w:pPr>
+        <w:pStyle w:val="HTMLPreformatted"/>
+        <w:ind w:left="600" w:right="600"/>
+        <w:divId w:val="1128549756"/>
+        <w:rPr>
+          <w:color w:val="1A1A1A"/>
+        </w:rPr>
+      </w:pPr>
+      <w:r>
+        <w:rPr>
+          <w:color w:val="1A1A1A"/>
+        </w:rPr>
+        <w:t xml:space="preserve">for j </w:t>
+      </w:r>
+      <w:r>
+        <w:rPr>
+          <w:color w:val="1A1A1A"/>
+        </w:rPr>
+        <w:t>←</w:t>
+      </w:r>
+      <w:r>
+        <w:rPr>
+          <w:color w:val="1A1A1A"/>
+        </w:rPr>
+        <w:t xml:space="preserve"> low to high - 1 do</w:t>
+      </w:r>
+    </w:p>
+    <w:p>
+      <w:pPr>
+        <w:pStyle w:val="HTMLPreformatted"/>
+        <w:ind w:left="600" w:right="600"/>
+        <w:divId w:val="1128549756"/>
+        <w:rPr>
+          <w:color w:val="1A1A1A"/>
+        </w:rPr>
+      </w:pPr>
+      <w:r>
+        <w:rPr>
+          <w:color w:val="1A1A1A"/>
+        </w:rPr>
+        <w:t xml:space="preserve">    if arr[j] </w:t>
+      </w:r>
+      <w:r>
+        <w:rPr>
+          <w:color w:val="1A1A1A"/>
+        </w:rPr>
+        <w:t>≤</w:t>
+      </w:r>
+      <w:r>
+        <w:rPr>
+          <w:color w:val="1A1A1A"/>
+        </w:rPr>
+        <w:t xml:space="preserve"> pivot then</w:t>
+      </w:r>
+    </w:p>
+    <w:p>
+      <w:pPr>
+        <w:pStyle w:val="HTMLPreformatted"/>
+        <w:ind w:left="600" w:right="600"/>
+        <w:divId w:val="1128549756"/>
+        <w:rPr>
+          <w:color w:val="1A1A1A"/>
+        </w:rPr>
+      </w:pPr>
+      <w:r>
+        <w:rPr>
+          <w:color w:val="1A1A1A"/>
+        </w:rPr>
+        <w:t xml:space="preserve">        i </w:t>
+      </w:r>
+      <w:r>
+        <w:rPr>
+          <w:color w:val="1A1A1A"/>
+        </w:rPr>
+        <w:t>←</w:t>
+      </w:r>
+      <w:r>
+        <w:rPr>
+          <w:color w:val="1A1A1A"/>
+        </w:rPr>
+        <w:t xml:space="preserve"> i + 1</w:t>
+      </w:r>
+    </w:p>
+    <w:p>
+      <w:pPr>
+        <w:pStyle w:val="HTMLPreformatted"/>
+        <w:ind w:left="600" w:right="600"/>
+        <w:divId w:val="1128549756"/>
+        <w:rPr>
+          <w:color w:val="1A1A1A"/>
+        </w:rPr>
+      </w:pPr>
+      <w:r>
+        <w:rPr>
+          <w:color w:val="1A1A1A"/>
+        </w:rPr>
+        <w:t xml:space="preserve">        SWAP(arr[i], arr[j])</w:t>
+      </w:r>
+    </w:p>
+    <w:p>
+      <w:pPr>
+        <w:pStyle w:val="HTMLPreformatted"/>
+        <w:ind w:left="600" w:right="600"/>
+        <w:divId w:val="1128549756"/>
+        <w:rPr>
+          <w:color w:val="1A1A1A"/>
+        </w:rPr>
+      </w:pPr>
+      <w:r>
+        <w:rPr>
+          <w:color w:val="1A1A1A"/>
+        </w:rPr>
+        <w:t xml:space="preserve">    end if</w:t>
+      </w:r>
+    </w:p>
+    <w:p>
+      <w:pPr>
+        <w:pStyle w:val="HTMLPreformatted"/>
+        <w:ind w:left="600" w:right="600"/>
+        <w:divId w:val="1128549756"/>
+        <w:rPr>
+          <w:color w:val="1A1A1A"/>
+        </w:rPr>
+      </w:pPr>
+      <w:r>
+        <w:rPr>
+          <w:color w:val="1A1A1A"/>
+        </w:rPr>
+        <w:t>end for</w:t>
+      </w:r>
+    </w:p>
+    <w:p>
+      <w:pPr>
+        <w:pStyle w:val="HTMLPreformatted"/>
+        <w:ind w:left="600" w:right="600"/>
+        <w:divId w:val="1128549756"/>
+        <w:rPr>
+          <w:color w:val="1A1A1A"/>
+        </w:rPr>
+      </w:pPr>
+      <w:r>
+        <w:rPr>
+          <w:color w:val="1A1A1A"/>
+        </w:rPr>
+        <w:t>SWAP(arr[i + 1], arr[high]) // place pivot at correct position</w:t>
+      </w:r>
+    </w:p>
+    <w:p>
+      <w:pPr>
+        <w:pStyle w:val="HTMLPreformatted"/>
+        <w:ind w:left="600" w:right="600"/>
+        <w:divId w:val="1128549756"/>
+        <w:rPr>
+          <w:color w:val="1A1A1A"/>
+        </w:rPr>
+      </w:pPr>
+      <w:r>
+        <w:rPr>
+          <w:color w:val="1A1A1A"/>
+        </w:rPr>
+        <w:t>return (i + 1) // pivot index</w:t>
+      </w:r>
+    </w:p>
+    <w:p>
+      <w:pPr>
+        <w:pStyle w:val="HTMLPreformatted"/>
+        <w:ind w:left="600" w:right="600"/>
+        <w:divId w:val="1128549756"/>
+        <w:rPr>
+          <w:color w:val="1A1A1A"/>
+        </w:rPr>
+      </w:pPr>
+      <w:r>
+        <w:rPr>
+          <w:color w:val="1A1A1A"/>
+        </w:rPr>
+        <w:t>End Procedure</w:t>
       </w:r>
     </w:p>
     <w:p>
       <w:pPr>
         <w:pStyle w:val="Heading2"/>
         <w:ind w:left="600" w:right="600"/>
-        <w:divId w:val="1978336600"/>
-        <w:rPr>
-          <w:rFonts w:ascii="Calibri" w:eastAsia="Times New Roman" w:hAnsi="Calibri" w:cs="Calibri"/>
-        </w:rPr>
-      </w:pPr>
-      <w:r>
-        <w:rPr>
-          <w:rFonts w:ascii="Calibri" w:eastAsia="Times New Roman" w:hAnsi="Calibri" w:cs="Calibri"/>
-        </w:rPr>
-        <w:t>8. GitHub Repository:</w:t>
+        <w:divId w:val="1128549756"/>
+        <w:rPr>
+          <w:rFonts w:ascii="Calibri" w:eastAsia="Times New Roman" w:hAnsi="Calibri" w:cs="Calibri"/>
+        </w:rPr>
+      </w:pPr>
+      <w:r>
+        <w:rPr>
+          <w:rFonts w:ascii="Calibri" w:eastAsia="Times New Roman" w:hAnsi="Calibri" w:cs="Calibri"/>
+        </w:rPr>
+        <w:t>Example to clearly see how Quick Sort works:</w:t>
       </w:r>
     </w:p>
     <w:p>
       <w:pPr>
         <w:pStyle w:val="NormalWeb"/>
         <w:ind w:left="600" w:right="600"/>
-        <w:divId w:val="1978336600"/>
-        <w:rPr>
-          <w:rFonts w:ascii="Calibri" w:hAnsi="Calibri" w:cs="Calibri"/>
-          <w:color w:val="1A1A1A"/>
-        </w:rPr>
-      </w:pPr>
+        <w:divId w:val="1128549756"/>
+        <w:rPr>
+          <w:rFonts w:ascii="Calibri" w:hAnsi="Calibri" w:cs="Calibri"/>
+          <w:color w:val="1A1A1A"/>
+        </w:rPr>
+      </w:pPr>
+      <w:r>
+        <w:rPr>
+          <w:rStyle w:val="Strong"/>
+          <w:rFonts w:ascii="Calibri" w:hAnsi="Calibri" w:cs="Calibri"/>
+          <w:color w:val="1A1A1A"/>
+        </w:rPr>
+        <w:t>Example Array:</w:t>
+      </w:r>
+      <w:r>
+        <w:rPr>
+          <w:rFonts w:ascii="Calibri" w:hAnsi="Calibri" w:cs="Calibri"/>
+          <w:color w:val="1A1A1A"/>
+        </w:rPr>
+        <w:t xml:space="preserve"> [3, 1, 4, 2]</w:t>
+      </w:r>
+    </w:p>
+    <w:p>
+      <w:pPr>
+        <w:pStyle w:val="NormalWeb"/>
+        <w:ind w:left="600" w:right="600"/>
+        <w:divId w:val="1128549756"/>
+        <w:rPr>
+          <w:rFonts w:ascii="Calibri" w:hAnsi="Calibri" w:cs="Calibri"/>
+          <w:color w:val="1A1A1A"/>
+        </w:rPr>
+      </w:pPr>
+      <w:r>
+        <w:rPr>
+          <w:rStyle w:val="Strong"/>
+          <w:rFonts w:ascii="Calibri" w:hAnsi="Calibri" w:cs="Calibri"/>
+          <w:color w:val="1A1A1A"/>
+        </w:rPr>
+        <w:t>Step 1: Choose pivot</w:t>
+      </w:r>
+      <w:r>
+        <w:rPr>
+          <w:rFonts w:ascii="Calibri" w:hAnsi="Calibri" w:cs="Calibri"/>
+          <w:color w:val="1A1A1A"/>
+        </w:rPr>
+        <w:br/>
+        <w:t xml:space="preserve">We choose the last element </w:t>
+      </w:r>
+      <w:r>
+        <w:rPr>
+          <w:rFonts w:ascii="Calibri" w:hAnsi="Calibri" w:cs="Calibri"/>
+          <w:color w:val="1A1A1A"/>
+        </w:rPr>
+        <w:t>→</w:t>
+      </w:r>
+      <w:r>
+        <w:rPr>
+          <w:rFonts w:ascii="Calibri" w:hAnsi="Calibri" w:cs="Calibri"/>
+          <w:color w:val="1A1A1A"/>
+        </w:rPr>
+        <w:t xml:space="preserve"> pivot = 2.</w:t>
+      </w:r>
+    </w:p>
+    <w:p>
+      <w:pPr>
+        <w:pStyle w:val="NormalWeb"/>
+        <w:ind w:left="600" w:right="600"/>
+        <w:divId w:val="1128549756"/>
+        <w:rPr>
+          <w:rFonts w:ascii="Calibri" w:hAnsi="Calibri" w:cs="Calibri"/>
+          <w:color w:val="1A1A1A"/>
+        </w:rPr>
+      </w:pPr>
+      <w:r>
+        <w:rPr>
+          <w:rStyle w:val="Strong"/>
+          <w:rFonts w:ascii="Calibri" w:hAnsi="Calibri" w:cs="Calibri"/>
+          <w:color w:val="1A1A1A"/>
+        </w:rPr>
+        <w:t>Step 2: Partition around pivot</w:t>
+      </w:r>
+      <w:r>
+        <w:rPr>
+          <w:rFonts w:ascii="Calibri" w:hAnsi="Calibri" w:cs="Calibri"/>
+          <w:color w:val="1A1A1A"/>
+        </w:rPr>
+        <w:br/>
+        <w:t>Compare each element with 2:</w:t>
+      </w:r>
+      <w:r>
+        <w:rPr>
+          <w:rFonts w:ascii="Calibri" w:hAnsi="Calibri" w:cs="Calibri"/>
+          <w:color w:val="1A1A1A"/>
+        </w:rPr>
+        <w:br/>
+        <w:t xml:space="preserve">3 &gt; 2 </w:t>
+      </w:r>
+      <w:r>
+        <w:rPr>
+          <w:rFonts w:ascii="Calibri" w:hAnsi="Calibri" w:cs="Calibri"/>
+          <w:color w:val="1A1A1A"/>
+        </w:rPr>
+        <w:t>→</w:t>
+      </w:r>
+      <w:r>
+        <w:rPr>
+          <w:rFonts w:ascii="Calibri" w:hAnsi="Calibri" w:cs="Calibri"/>
+          <w:color w:val="1A1A1A"/>
+        </w:rPr>
+        <w:t xml:space="preserve"> goes to right</w:t>
+      </w:r>
+      <w:r>
+        <w:rPr>
+          <w:rFonts w:ascii="Calibri" w:hAnsi="Calibri" w:cs="Calibri"/>
+          <w:color w:val="1A1A1A"/>
+        </w:rPr>
+        <w:br/>
+        <w:t xml:space="preserve">1 &lt; 2 </w:t>
+      </w:r>
+      <w:r>
+        <w:rPr>
+          <w:rFonts w:ascii="Calibri" w:hAnsi="Calibri" w:cs="Calibri"/>
+          <w:color w:val="1A1A1A"/>
+        </w:rPr>
+        <w:t>→</w:t>
+      </w:r>
+      <w:r>
+        <w:rPr>
+          <w:rFonts w:ascii="Calibri" w:hAnsi="Calibri" w:cs="Calibri"/>
+          <w:color w:val="1A1A1A"/>
+        </w:rPr>
+        <w:t xml:space="preserve"> goes to left</w:t>
+      </w:r>
+      <w:r>
+        <w:rPr>
+          <w:rFonts w:ascii="Calibri" w:hAnsi="Calibri" w:cs="Calibri"/>
+          <w:color w:val="1A1A1A"/>
+        </w:rPr>
+        <w:br/>
+        <w:t xml:space="preserve">4 &gt; 2 </w:t>
+      </w:r>
+      <w:r>
+        <w:rPr>
+          <w:rFonts w:ascii="Calibri" w:hAnsi="Calibri" w:cs="Calibri"/>
+          <w:color w:val="1A1A1A"/>
+        </w:rPr>
+        <w:t>→</w:t>
+      </w:r>
+      <w:r>
+        <w:rPr>
+          <w:rFonts w:ascii="Calibri" w:hAnsi="Calibri" w:cs="Calibri"/>
+          <w:color w:val="1A1A1A"/>
+        </w:rPr>
+        <w:t xml:space="preserve"> goes to right</w:t>
+      </w:r>
+      <w:r>
+        <w:rPr>
+          <w:rFonts w:ascii="Calibri" w:hAnsi="Calibri" w:cs="Calibri"/>
+          <w:color w:val="1A1A1A"/>
+        </w:rPr>
+        <w:br/>
+        <w:t>After partition: [1, 2, 4, 3]</w:t>
+      </w:r>
+      <w:r>
+        <w:rPr>
+          <w:rFonts w:ascii="Calibri" w:hAnsi="Calibri" w:cs="Calibri"/>
+          <w:color w:val="1A1A1A"/>
+        </w:rPr>
+        <w:br/>
+        <w:t>Pivot 2 is in its correct sorted position.</w:t>
+      </w:r>
+    </w:p>
+    <w:p>
+      <w:pPr>
+        <w:pStyle w:val="NormalWeb"/>
+        <w:ind w:left="600" w:right="600"/>
+        <w:divId w:val="1128549756"/>
+        <w:rPr>
+          <w:rFonts w:ascii="Calibri" w:hAnsi="Calibri" w:cs="Calibri"/>
+          <w:color w:val="1A1A1A"/>
+        </w:rPr>
+      </w:pPr>
+      <w:r>
+        <w:rPr>
+          <w:rStyle w:val="Strong"/>
+          <w:rFonts w:ascii="Calibri" w:hAnsi="Calibri" w:cs="Calibri"/>
+          <w:color w:val="1A1A1A"/>
+        </w:rPr>
+        <w:t>Step 3: Recursive calls</w:t>
+      </w:r>
+      <w:r>
+        <w:rPr>
+          <w:rFonts w:ascii="Calibri" w:hAnsi="Calibri" w:cs="Calibri"/>
+          <w:color w:val="1A1A1A"/>
+        </w:rPr>
+        <w:br/>
+        <w:t xml:space="preserve">Left subarray: [1] </w:t>
+      </w:r>
+      <w:r>
+        <w:rPr>
+          <w:rFonts w:ascii="Calibri" w:hAnsi="Calibri" w:cs="Calibri"/>
+          <w:color w:val="1A1A1A"/>
+        </w:rPr>
+        <w:t>→</w:t>
+      </w:r>
+      <w:r>
+        <w:rPr>
+          <w:rFonts w:ascii="Calibri" w:hAnsi="Calibri" w:cs="Calibri"/>
+          <w:color w:val="1A1A1A"/>
+        </w:rPr>
+        <w:t xml:space="preserve"> already sorted</w:t>
+      </w:r>
+      <w:r>
+        <w:rPr>
+          <w:rFonts w:ascii="Calibri" w:hAnsi="Calibri" w:cs="Calibri"/>
+          <w:color w:val="1A1A1A"/>
+        </w:rPr>
+        <w:br/>
+        <w:t>Right subarray: [4, 3]</w:t>
+      </w:r>
+    </w:p>
+    <w:p>
+      <w:pPr>
+        <w:pStyle w:val="NormalWeb"/>
+        <w:ind w:left="600" w:right="600"/>
+        <w:divId w:val="1128549756"/>
+        <w:rPr>
+          <w:rFonts w:ascii="Calibri" w:hAnsi="Calibri" w:cs="Calibri"/>
+          <w:color w:val="1A1A1A"/>
+        </w:rPr>
+      </w:pPr>
+      <w:r>
+        <w:rPr>
+          <w:rStyle w:val="Strong"/>
+          <w:rFonts w:ascii="Calibri" w:hAnsi="Calibri" w:cs="Calibri"/>
+          <w:color w:val="1A1A1A"/>
+        </w:rPr>
+        <w:t>Step 4: Quick Sort on [4, 3]</w:t>
+      </w:r>
+      <w:r>
+        <w:rPr>
+          <w:rFonts w:ascii="Calibri" w:hAnsi="Calibri" w:cs="Calibri"/>
+          <w:color w:val="1A1A1A"/>
+        </w:rPr>
+        <w:br/>
+        <w:t>Pivot = 3</w:t>
+      </w:r>
+      <w:r>
+        <w:rPr>
+          <w:rFonts w:ascii="Calibri" w:hAnsi="Calibri" w:cs="Calibri"/>
+          <w:color w:val="1A1A1A"/>
+        </w:rPr>
+        <w:br/>
+        <w:t xml:space="preserve">Compare: 4 &gt; 3 </w:t>
+      </w:r>
+      <w:r>
+        <w:rPr>
+          <w:rFonts w:ascii="Calibri" w:hAnsi="Calibri" w:cs="Calibri"/>
+          <w:color w:val="1A1A1A"/>
+        </w:rPr>
+        <w:t>→</w:t>
+      </w:r>
+      <w:r>
+        <w:rPr>
+          <w:rFonts w:ascii="Calibri" w:hAnsi="Calibri" w:cs="Calibri"/>
+          <w:color w:val="1A1A1A"/>
+        </w:rPr>
+        <w:t xml:space="preserve"> goes right</w:t>
+      </w:r>
+      <w:r>
+        <w:rPr>
+          <w:rFonts w:ascii="Calibri" w:hAnsi="Calibri" w:cs="Calibri"/>
+          <w:color w:val="1A1A1A"/>
+        </w:rPr>
+        <w:br/>
+        <w:t>After partition: [3, 4]</w:t>
+      </w:r>
+    </w:p>
+    <w:p>
+      <w:pPr>
+        <w:pStyle w:val="NormalWeb"/>
+        <w:ind w:left="600" w:right="600"/>
+        <w:divId w:val="1128549756"/>
+        <w:rPr>
+          <w:rFonts w:ascii="Calibri" w:hAnsi="Calibri" w:cs="Calibri"/>
+          <w:color w:val="1A1A1A"/>
+        </w:rPr>
+      </w:pPr>
+      <w:r>
+        <w:rPr>
+          <w:rStyle w:val="Strong"/>
+          <w:rFonts w:ascii="Calibri" w:hAnsi="Calibri" w:cs="Calibri"/>
+          <w:color w:val="1A1A1A"/>
+        </w:rPr>
+        <w:t>Final Sorted Array</w:t>
+      </w:r>
+      <w:r>
+        <w:rPr>
+          <w:rFonts w:ascii="Calibri" w:hAnsi="Calibri" w:cs="Calibri"/>
+          <w:color w:val="1A1A1A"/>
+        </w:rPr>
+        <w:br/>
+        <w:t>Combine results: [1, 2, 3, 4]</w:t>
+      </w:r>
+    </w:p>
+    <w:p>
+      <w:pPr>
+        <w:pStyle w:val="Heading2"/>
+        <w:ind w:left="600" w:right="600"/>
+        <w:divId w:val="1128549756"/>
+        <w:rPr>
+          <w:rFonts w:ascii="Calibri" w:eastAsia="Times New Roman" w:hAnsi="Calibri" w:cs="Calibri"/>
+        </w:rPr>
+      </w:pPr>
+      <w:r>
+        <w:rPr>
+          <w:rFonts w:ascii="Calibri" w:eastAsia="Times New Roman" w:hAnsi="Calibri" w:cs="Calibri"/>
+        </w:rPr>
+        <w:t>Flow Diagram:</w:t>
+      </w:r>
+    </w:p>
+    <w:p>
+      <w:pPr>
+        <w:pStyle w:val="HTMLPreformatted"/>
+        <w:ind w:left="600" w:right="600"/>
+        <w:divId w:val="1128549756"/>
+        <w:rPr>
+          <w:color w:val="1A1A1A"/>
+        </w:rPr>
+      </w:pPr>
+    </w:p>
+    <w:p>
+      <w:pPr>
+        <w:pStyle w:val="HTMLPreformatted"/>
+        <w:ind w:left="600" w:right="600"/>
+        <w:divId w:val="1128549756"/>
+        <w:rPr>
+          <w:color w:val="1A1A1A"/>
+        </w:rPr>
+      </w:pPr>
+      <w:r>
+        <w:rPr>
+          <w:color w:val="1A1A1A"/>
+        </w:rPr>
+        <w:t xml:space="preserve">                     +-----------------------+</w:t>
+      </w:r>
+    </w:p>
+    <w:p>
+      <w:pPr>
+        <w:pStyle w:val="HTMLPreformatted"/>
+        <w:ind w:left="600" w:right="600"/>
+        <w:divId w:val="1128549756"/>
+        <w:rPr>
+          <w:color w:val="1A1A1A"/>
+        </w:rPr>
+      </w:pPr>
+      <w:r>
+        <w:rPr>
+          <w:color w:val="1A1A1A"/>
+        </w:rPr>
+        <w:t xml:space="preserve">                     |         Start         |</w:t>
+      </w:r>
+    </w:p>
+    <w:p>
+      <w:pPr>
+        <w:pStyle w:val="HTMLPreformatted"/>
+        <w:ind w:left="600" w:right="600"/>
+        <w:divId w:val="1128549756"/>
+        <w:rPr>
+          <w:color w:val="1A1A1A"/>
+        </w:rPr>
+      </w:pPr>
+      <w:r>
+        <w:rPr>
+          <w:color w:val="1A1A1A"/>
+        </w:rPr>
+        <w:t xml:space="preserve">                     +-----------+-----------+</w:t>
+      </w:r>
+    </w:p>
+    <w:p>
+      <w:pPr>
+        <w:pStyle w:val="HTMLPreformatted"/>
+        <w:ind w:left="600" w:right="600"/>
+        <w:divId w:val="1128549756"/>
+        <w:rPr>
+          <w:color w:val="1A1A1A"/>
+        </w:rPr>
+      </w:pPr>
+      <w:r>
+        <w:rPr>
+          <w:color w:val="1A1A1A"/>
+        </w:rPr>
+        <w:t xml:space="preserve">                                 |</w:t>
+      </w:r>
+    </w:p>
+    <w:p>
+      <w:pPr>
+        <w:pStyle w:val="HTMLPreformatted"/>
+        <w:ind w:left="600" w:right="600"/>
+        <w:divId w:val="1128549756"/>
+        <w:rPr>
+          <w:color w:val="1A1A1A"/>
+        </w:rPr>
+      </w:pPr>
+      <w:r>
+        <w:rPr>
+          <w:color w:val="1A1A1A"/>
+        </w:rPr>
+        <w:t xml:space="preserve">                     +-----------v-----------+</w:t>
+      </w:r>
+    </w:p>
+    <w:p>
+      <w:pPr>
+        <w:pStyle w:val="HTMLPreformatted"/>
+        <w:ind w:left="600" w:right="600"/>
+        <w:divId w:val="1128549756"/>
+        <w:rPr>
+          <w:color w:val="1A1A1A"/>
+        </w:rPr>
+      </w:pPr>
+      <w:r>
+        <w:rPr>
+          <w:color w:val="1A1A1A"/>
+        </w:rPr>
+        <w:t xml:space="preserve">                     | Output header &amp;       |</w:t>
+      </w:r>
+    </w:p>
+    <w:p>
+      <w:pPr>
+        <w:pStyle w:val="HTMLPreformatted"/>
+        <w:ind w:left="600" w:right="600"/>
+        <w:divId w:val="1128549756"/>
+        <w:rPr>
+          <w:color w:val="1A1A1A"/>
+        </w:rPr>
+      </w:pPr>
+      <w:r>
+        <w:rPr>
+          <w:color w:val="1A1A1A"/>
+        </w:rPr>
+        <w:t xml:space="preserve">                     | prompt user for input |</w:t>
+      </w:r>
+    </w:p>
+    <w:p>
+      <w:pPr>
+        <w:pStyle w:val="HTMLPreformatted"/>
+        <w:ind w:left="600" w:right="600"/>
+        <w:divId w:val="1128549756"/>
+        <w:rPr>
+          <w:color w:val="1A1A1A"/>
+        </w:rPr>
+      </w:pPr>
+      <w:r>
+        <w:rPr>
+          <w:color w:val="1A1A1A"/>
+        </w:rPr>
+        <w:t xml:space="preserve">                     +-----------+-----------+</w:t>
+      </w:r>
+    </w:p>
+    <w:p>
+      <w:pPr>
+        <w:pStyle w:val="HTMLPreformatted"/>
+        <w:ind w:left="600" w:right="600"/>
+        <w:divId w:val="1128549756"/>
+        <w:rPr>
+          <w:color w:val="1A1A1A"/>
+        </w:rPr>
+      </w:pPr>
+      <w:r>
+        <w:rPr>
+          <w:color w:val="1A1A1A"/>
+        </w:rPr>
+        <w:t xml:space="preserve">                                 |</w:t>
+      </w:r>
+    </w:p>
+    <w:p>
+      <w:pPr>
+        <w:pStyle w:val="HTMLPreformatted"/>
+        <w:ind w:left="600" w:right="600"/>
+        <w:divId w:val="1128549756"/>
+        <w:rPr>
+          <w:color w:val="1A1A1A"/>
+        </w:rPr>
+      </w:pPr>
+      <w:r>
+        <w:rPr>
+          <w:color w:val="1A1A1A"/>
+        </w:rPr>
+        <w:t xml:space="preserve">                     +-----------v-----------+</w:t>
+      </w:r>
+    </w:p>
+    <w:p>
+      <w:pPr>
+        <w:pStyle w:val="HTMLPreformatted"/>
+        <w:ind w:left="600" w:right="600"/>
+        <w:divId w:val="1128549756"/>
+        <w:rPr>
+          <w:color w:val="1A1A1A"/>
+        </w:rPr>
+      </w:pPr>
+      <w:r>
+        <w:rPr>
+          <w:color w:val="1A1A1A"/>
+        </w:rPr>
+        <w:t xml:space="preserve">                     | Retrieve input from   |</w:t>
+      </w:r>
+    </w:p>
+    <w:p>
+      <w:pPr>
+        <w:pStyle w:val="HTMLPreformatted"/>
+        <w:ind w:left="600" w:right="600"/>
+        <w:divId w:val="1128549756"/>
+        <w:rPr>
+          <w:color w:val="1A1A1A"/>
+        </w:rPr>
+      </w:pPr>
+      <w:r>
+        <w:rPr>
+          <w:color w:val="1A1A1A"/>
+        </w:rPr>
+        <w:t xml:space="preserve">    </w:t>
+      </w:r>
+      <w:r>
+        <w:rPr>
+          <w:color w:val="1A1A1A"/>
+        </w:rPr>
+        <w:t xml:space="preserve">                 | user into array       |</w:t>
+      </w:r>
+    </w:p>
+    <w:p>
+      <w:pPr>
+        <w:pStyle w:val="HTMLPreformatted"/>
+        <w:ind w:left="600" w:right="600"/>
+        <w:divId w:val="1128549756"/>
+        <w:rPr>
+          <w:color w:val="1A1A1A"/>
+        </w:rPr>
+      </w:pPr>
+      <w:r>
+        <w:rPr>
+          <w:color w:val="1A1A1A"/>
+        </w:rPr>
+        <w:t xml:space="preserve">                     +-----------+-----------+</w:t>
+      </w:r>
+    </w:p>
+    <w:p>
+      <w:pPr>
+        <w:pStyle w:val="HTMLPreformatted"/>
+        <w:ind w:left="600" w:right="600"/>
+        <w:divId w:val="1128549756"/>
+        <w:rPr>
+          <w:color w:val="1A1A1A"/>
+        </w:rPr>
+      </w:pPr>
+      <w:r>
+        <w:rPr>
+          <w:color w:val="1A1A1A"/>
+        </w:rPr>
+        <w:t xml:space="preserve">                                 |</w:t>
+      </w:r>
+    </w:p>
+    <w:p>
+      <w:pPr>
+        <w:pStyle w:val="HTMLPreformatted"/>
+        <w:ind w:left="600" w:right="600"/>
+        <w:divId w:val="1128549756"/>
+        <w:rPr>
+          <w:color w:val="1A1A1A"/>
+        </w:rPr>
+      </w:pPr>
+      <w:r>
+        <w:rPr>
+          <w:color w:val="1A1A1A"/>
+        </w:rPr>
+        <w:t xml:space="preserve">                     +-----------v-----------+</w:t>
+      </w:r>
+    </w:p>
+    <w:p>
+      <w:pPr>
+        <w:pStyle w:val="HTMLPreformatted"/>
+        <w:ind w:left="600" w:right="600"/>
+        <w:divId w:val="1128549756"/>
+        <w:rPr>
+          <w:color w:val="1A1A1A"/>
+        </w:rPr>
+      </w:pPr>
+      <w:r>
+        <w:rPr>
+          <w:color w:val="1A1A1A"/>
+        </w:rPr>
+        <w:t xml:space="preserve">                     | Print unsorted array  |</w:t>
+      </w:r>
+    </w:p>
+    <w:p>
+      <w:pPr>
+        <w:pStyle w:val="HTMLPreformatted"/>
+        <w:ind w:left="600" w:right="600"/>
+        <w:divId w:val="1128549756"/>
+        <w:rPr>
+          <w:color w:val="1A1A1A"/>
+        </w:rPr>
+      </w:pPr>
+      <w:r>
+        <w:rPr>
+          <w:color w:val="1A1A1A"/>
+        </w:rPr>
+        <w:t xml:space="preserve">                     +-----------+-----------+</w:t>
+      </w:r>
+    </w:p>
+    <w:p>
+      <w:pPr>
+        <w:pStyle w:val="HTMLPreformatted"/>
+        <w:ind w:left="600" w:right="600"/>
+        <w:divId w:val="1128549756"/>
+        <w:rPr>
+          <w:color w:val="1A1A1A"/>
+        </w:rPr>
+      </w:pPr>
+      <w:r>
+        <w:rPr>
+          <w:color w:val="1A1A1A"/>
+        </w:rPr>
+        <w:t xml:space="preserve">                                 |</w:t>
+      </w:r>
+    </w:p>
+    <w:p>
+      <w:pPr>
+        <w:pStyle w:val="HTMLPreformatted"/>
+        <w:ind w:left="600" w:right="600"/>
+        <w:divId w:val="1128549756"/>
+        <w:rPr>
+          <w:color w:val="1A1A1A"/>
+        </w:rPr>
+      </w:pPr>
+      <w:r>
+        <w:rPr>
+          <w:color w:val="1A1A1A"/>
+        </w:rPr>
+        <w:t xml:space="preserve">                     +-----------v-----------+</w:t>
+      </w:r>
+    </w:p>
+    <w:p>
+      <w:pPr>
+        <w:pStyle w:val="HTMLPreformatted"/>
+        <w:ind w:left="600" w:right="600"/>
+        <w:divId w:val="1128549756"/>
+        <w:rPr>
+          <w:color w:val="1A1A1A"/>
+        </w:rPr>
+      </w:pPr>
+      <w:r>
+        <w:rPr>
+          <w:color w:val="1A1A1A"/>
+        </w:rPr>
+        <w:t xml:space="preserve">                     | Split the array into  |</w:t>
+      </w:r>
+    </w:p>
+    <w:p>
+      <w:pPr>
+        <w:pStyle w:val="HTMLPreformatted"/>
+        <w:ind w:left="600" w:right="600"/>
+        <w:divId w:val="1128549756"/>
+        <w:rPr>
+          <w:color w:val="1A1A1A"/>
+        </w:rPr>
+      </w:pPr>
+      <w:r>
+        <w:rPr>
+          <w:color w:val="1A1A1A"/>
+        </w:rPr>
+        <w:t xml:space="preserve">                     | 2 sorted batches      |</w:t>
+      </w:r>
+    </w:p>
+    <w:p>
+      <w:pPr>
+        <w:pStyle w:val="HTMLPreformatted"/>
+        <w:ind w:left="600" w:right="600"/>
+        <w:divId w:val="1128549756"/>
+        <w:rPr>
+          <w:color w:val="1A1A1A"/>
+        </w:rPr>
+      </w:pPr>
+      <w:r>
+        <w:rPr>
+          <w:color w:val="1A1A1A"/>
+        </w:rPr>
+        <w:t xml:space="preserve">                     | using pivot           |</w:t>
+      </w:r>
+    </w:p>
+    <w:p>
+      <w:pPr>
+        <w:pStyle w:val="HTMLPreformatted"/>
+        <w:ind w:left="600" w:right="600"/>
+        <w:divId w:val="1128549756"/>
+        <w:rPr>
+          <w:color w:val="1A1A1A"/>
+        </w:rPr>
+      </w:pPr>
+      <w:r>
+        <w:rPr>
+          <w:color w:val="1A1A1A"/>
+        </w:rPr>
+        <w:t xml:space="preserve">                     </w:t>
+      </w:r>
+      <w:r>
+        <w:rPr>
+          <w:color w:val="1A1A1A"/>
+        </w:rPr>
+        <w:t>+-----------+-----------+</w:t>
+      </w:r>
+    </w:p>
+    <w:p>
+      <w:pPr>
+        <w:pStyle w:val="HTMLPreformatted"/>
+        <w:ind w:left="600" w:right="600"/>
+        <w:divId w:val="1128549756"/>
+        <w:rPr>
+          <w:color w:val="1A1A1A"/>
+        </w:rPr>
+      </w:pPr>
+      <w:r>
+        <w:rPr>
+          <w:color w:val="1A1A1A"/>
+        </w:rPr>
+        <w:t xml:space="preserve">                                 |</w:t>
+      </w:r>
+    </w:p>
+    <w:p>
+      <w:pPr>
+        <w:pStyle w:val="HTMLPreformatted"/>
+        <w:ind w:left="600" w:right="600"/>
+        <w:divId w:val="1128549756"/>
+        <w:rPr>
+          <w:color w:val="1A1A1A"/>
+        </w:rPr>
+      </w:pPr>
+      <w:r>
+        <w:rPr>
+          <w:color w:val="1A1A1A"/>
+        </w:rPr>
+        <w:t xml:space="preserve">                     +-----------v-----------+</w:t>
+      </w:r>
+    </w:p>
+    <w:p>
+      <w:pPr>
+        <w:pStyle w:val="HTMLPreformatted"/>
+        <w:ind w:left="600" w:right="600"/>
+        <w:divId w:val="1128549756"/>
+        <w:rPr>
+          <w:color w:val="1A1A1A"/>
+        </w:rPr>
+      </w:pPr>
+      <w:r>
+        <w:rPr>
+          <w:color w:val="1A1A1A"/>
+        </w:rPr>
+        <w:t xml:space="preserve">                     | Batch size == 1?      |</w:t>
+      </w:r>
+    </w:p>
+    <w:p>
+      <w:pPr>
+        <w:pStyle w:val="HTMLPreformatted"/>
+        <w:ind w:left="600" w:right="600"/>
+        <w:divId w:val="1128549756"/>
+        <w:rPr>
+          <w:color w:val="1A1A1A"/>
+        </w:rPr>
+      </w:pPr>
+      <w:r>
+        <w:rPr>
+          <w:color w:val="1A1A1A"/>
+        </w:rPr>
+        <w:t xml:space="preserve">                     +-----+-----------+-----+</w:t>
+      </w:r>
+    </w:p>
+    <w:p>
+      <w:pPr>
+        <w:pStyle w:val="HTMLPreformatted"/>
+        <w:ind w:left="600" w:right="600"/>
+        <w:divId w:val="1128549756"/>
+        <w:rPr>
+          <w:color w:val="1A1A1A"/>
+        </w:rPr>
+      </w:pPr>
+      <w:r>
+        <w:rPr>
+          <w:color w:val="1A1A1A"/>
+        </w:rPr>
+        <w:t xml:space="preserve">                           |           |</w:t>
+      </w:r>
+    </w:p>
+    <w:p>
+      <w:pPr>
+        <w:pStyle w:val="HTMLPreformatted"/>
+        <w:ind w:left="600" w:right="600"/>
+        <w:divId w:val="1128549756"/>
+        <w:rPr>
+          <w:color w:val="1A1A1A"/>
+        </w:rPr>
+      </w:pPr>
+      <w:r>
+        <w:rPr>
+          <w:color w:val="1A1A1A"/>
+        </w:rPr>
+        <w:t xml:space="preserve">                      Yes  |           | No</w:t>
+      </w:r>
+    </w:p>
+    <w:p>
+      <w:pPr>
+        <w:pStyle w:val="HTMLPreformatted"/>
+        <w:ind w:left="600" w:right="600"/>
+        <w:divId w:val="1128549756"/>
+        <w:rPr>
+          <w:color w:val="1A1A1A"/>
+        </w:rPr>
+      </w:pPr>
+      <w:r>
+        <w:rPr>
+          <w:color w:val="1A1A1A"/>
+        </w:rPr>
+        <w:t xml:space="preserve">                           v           v</w:t>
+      </w:r>
+    </w:p>
+    <w:p>
+      <w:pPr>
+        <w:pStyle w:val="HTMLPreformatted"/>
+        <w:ind w:left="600" w:right="600"/>
+        <w:divId w:val="1128549756"/>
+        <w:rPr>
+          <w:color w:val="1A1A1A"/>
+        </w:rPr>
+      </w:pPr>
+      <w:r>
+        <w:rPr>
+          <w:color w:val="1A1A1A"/>
+        </w:rPr>
+        <w:t xml:space="preserve">            +--------------+-------+ +-+--------------------+</w:t>
+      </w:r>
+    </w:p>
+    <w:p>
+      <w:pPr>
+        <w:pStyle w:val="HTMLPreformatted"/>
+        <w:ind w:left="600" w:right="600"/>
+        <w:divId w:val="1128549756"/>
+        <w:rPr>
+          <w:color w:val="1A1A1A"/>
+        </w:rPr>
+      </w:pPr>
+      <w:r>
+        <w:rPr>
+          <w:color w:val="1A1A1A"/>
+        </w:rPr>
+        <w:t xml:space="preserve">            | Output sorted array   | | Sort each partition |</w:t>
+      </w:r>
+    </w:p>
+    <w:p>
+      <w:pPr>
+        <w:pStyle w:val="HTMLPreformatted"/>
+        <w:ind w:left="600" w:right="600"/>
+        <w:divId w:val="1128549756"/>
+        <w:rPr>
+          <w:color w:val="1A1A1A"/>
+        </w:rPr>
+      </w:pPr>
+      <w:r>
+        <w:rPr>
+          <w:color w:val="1A1A1A"/>
+        </w:rPr>
+        <w:t xml:space="preserve">            </w:t>
+      </w:r>
+      <w:r>
+        <w:rPr>
+          <w:color w:val="1A1A1A"/>
+        </w:rPr>
+        <w:t>+--------------+-------+ | set recursively using|</w:t>
+      </w:r>
+    </w:p>
+    <w:p>
+      <w:pPr>
+        <w:pStyle w:val="HTMLPreformatted"/>
+        <w:ind w:left="600" w:right="600"/>
+        <w:divId w:val="1128549756"/>
+        <w:rPr>
+          <w:color w:val="1A1A1A"/>
+        </w:rPr>
+      </w:pPr>
+      <w:r>
+        <w:rPr>
+          <w:color w:val="1A1A1A"/>
+        </w:rPr>
+        <w:t xml:space="preserve">                           |         | the quick sort       |</w:t>
+      </w:r>
+    </w:p>
+    <w:p>
+      <w:pPr>
+        <w:pStyle w:val="HTMLPreformatted"/>
+        <w:ind w:left="600" w:right="600"/>
+        <w:divId w:val="1128549756"/>
+        <w:rPr>
+          <w:color w:val="1A1A1A"/>
+        </w:rPr>
+      </w:pPr>
+      <w:r>
+        <w:rPr>
+          <w:color w:val="1A1A1A"/>
+        </w:rPr>
+        <w:t xml:space="preserve">                           |         | function.            |</w:t>
+      </w:r>
+    </w:p>
+    <w:p>
+      <w:pPr>
+        <w:pStyle w:val="HTMLPreformatted"/>
+        <w:ind w:left="600" w:right="600"/>
+        <w:divId w:val="1128549756"/>
+        <w:rPr>
+          <w:color w:val="1A1A1A"/>
+        </w:rPr>
+      </w:pPr>
+      <w:r>
+        <w:rPr>
+          <w:color w:val="1A1A1A"/>
+        </w:rPr>
+        <w:t xml:space="preserve">                           |         +----------+-----------+</w:t>
+      </w:r>
+    </w:p>
+    <w:p>
+      <w:pPr>
+        <w:pStyle w:val="HTMLPreformatted"/>
+        <w:ind w:left="600" w:right="600"/>
+        <w:divId w:val="1128549756"/>
+        <w:rPr>
+          <w:color w:val="1A1A1A"/>
+        </w:rPr>
+      </w:pPr>
+      <w:r>
+        <w:rPr>
+          <w:color w:val="1A1A1A"/>
+        </w:rPr>
+        <w:t xml:space="preserve">                           |                    |</w:t>
+      </w:r>
+    </w:p>
+    <w:p>
+      <w:pPr>
+        <w:pStyle w:val="HTMLPreformatted"/>
+        <w:ind w:left="600" w:right="600"/>
+        <w:divId w:val="1128549756"/>
+        <w:rPr>
+          <w:color w:val="1A1A1A"/>
+        </w:rPr>
+      </w:pPr>
+      <w:r>
+        <w:rPr>
+          <w:color w:val="1A1A1A"/>
+        </w:rPr>
+        <w:t xml:space="preserve">                           +--------------------+</w:t>
+      </w:r>
+    </w:p>
+    <w:p>
+      <w:pPr>
+        <w:pStyle w:val="HTMLPreformatted"/>
+        <w:ind w:left="600" w:right="600"/>
+        <w:divId w:val="1128549756"/>
+        <w:rPr>
+          <w:color w:val="1A1A1A"/>
+        </w:rPr>
+      </w:pPr>
+      <w:r>
+        <w:rPr>
+          <w:color w:val="1A1A1A"/>
+        </w:rPr>
+        <w:t xml:space="preserve">                                 |</w:t>
+      </w:r>
+    </w:p>
+    <w:p>
+      <w:pPr>
+        <w:pStyle w:val="HTMLPreformatted"/>
+        <w:ind w:left="600" w:right="600"/>
+        <w:divId w:val="1128549756"/>
+        <w:rPr>
+          <w:color w:val="1A1A1A"/>
+        </w:rPr>
+      </w:pPr>
+      <w:r>
+        <w:rPr>
+          <w:color w:val="1A1A1A"/>
+        </w:rPr>
+        <w:t xml:space="preserve">                     +-----------v-----------+</w:t>
+      </w:r>
+    </w:p>
+    <w:p>
+      <w:pPr>
+        <w:pStyle w:val="HTMLPreformatted"/>
+        <w:ind w:left="600" w:right="600"/>
+        <w:divId w:val="1128549756"/>
+        <w:rPr>
+          <w:color w:val="1A1A1A"/>
+        </w:rPr>
+      </w:pPr>
+      <w:r>
+        <w:rPr>
+          <w:color w:val="1A1A1A"/>
+        </w:rPr>
+        <w:t xml:space="preserve">                     |          End          |</w:t>
+      </w:r>
+    </w:p>
+    <w:p>
+      <w:pPr>
+        <w:pStyle w:val="HTMLPreformatted"/>
+        <w:ind w:left="600" w:right="600"/>
+        <w:divId w:val="1128549756"/>
+        <w:rPr>
+          <w:color w:val="1A1A1A"/>
+        </w:rPr>
+      </w:pPr>
+      <w:r>
+        <w:rPr>
+          <w:color w:val="1A1A1A"/>
+        </w:rPr>
+        <w:t xml:space="preserve">                     +-----------------------+</w:t>
+      </w:r>
+    </w:p>
+    <w:p>
+      <w:pPr>
+        <w:pStyle w:val="Heading2"/>
+        <w:ind w:left="600" w:right="600"/>
+        <w:divId w:val="1128549756"/>
+        <w:rPr>
+          <w:rFonts w:ascii="Calibri" w:eastAsia="Times New Roman" w:hAnsi="Calibri" w:cs="Calibri"/>
+        </w:rPr>
+      </w:pPr>
+      <w:r>
+        <w:rPr>
+          <w:rFonts w:ascii="Calibri" w:eastAsia="Times New Roman" w:hAnsi="Calibri" w:cs="Calibri"/>
+        </w:rPr>
+        <w:t>Output:</w:t>
+      </w:r>
+    </w:p>
+    <w:p>
+      <w:pPr>
+        <w:pStyle w:val="NormalWeb"/>
+        <w:ind w:left="600" w:right="600"/>
+        <w:divId w:val="1128549756"/>
+        <w:rPr>
+          <w:rFonts w:ascii="Calibri" w:hAnsi="Calibri" w:cs="Calibri"/>
+          <w:color w:val="1A1A1A"/>
+        </w:rPr>
+      </w:pPr>
+      <w:r>
+        <w:rPr>
+          <w:rFonts w:ascii="Calibri" w:hAnsi="Calibri" w:cs="Calibri"/>
+          <w:color w:val="1A1A1A"/>
+        </w:rPr>
+        <w:t>Example Dataset (sorted by IMDB rating)</w:t>
+      </w:r>
+      <w:r>
+        <w:rPr>
+          <w:rFonts w:ascii="Calibri" w:hAnsi="Calibri" w:cs="Calibri"/>
+          <w:color w:val="1A1A1A"/>
+        </w:rPr>
+        <w:br/>
+        <w:t>Movies with ratings: [8.2, 6.5, 9.0, 7.3, 8.7]</w:t>
+      </w:r>
+    </w:p>
+    <w:p>
+      <w:pPr>
+        <w:pStyle w:val="NormalWeb"/>
+        <w:ind w:left="600" w:right="600"/>
+        <w:divId w:val="1128549756"/>
+        <w:rPr>
+          <w:rFonts w:ascii="Calibri" w:hAnsi="Calibri" w:cs="Calibri"/>
+          <w:color w:val="1A1A1A"/>
+        </w:rPr>
+      </w:pPr>
+      <w:r>
+        <w:rPr>
+          <w:rStyle w:val="Strong"/>
+          <w:rFonts w:ascii="Calibri" w:hAnsi="Calibri" w:cs="Calibri"/>
+          <w:color w:val="1A1A1A"/>
+        </w:rPr>
+        <w:t>Step 1: Divide</w:t>
+      </w:r>
+      <w:r>
+        <w:rPr>
+          <w:rFonts w:ascii="Calibri" w:hAnsi="Calibri" w:cs="Calibri"/>
+          <w:color w:val="1A1A1A"/>
+        </w:rPr>
+        <w:br/>
+        <w:t xml:space="preserve">Choose pivot (last element) </w:t>
+      </w:r>
+      <w:r>
+        <w:rPr>
+          <w:rFonts w:ascii="Calibri" w:hAnsi="Calibri" w:cs="Calibri"/>
+          <w:color w:val="1A1A1A"/>
+        </w:rPr>
+        <w:t>→</w:t>
+      </w:r>
+      <w:r>
+        <w:rPr>
+          <w:rFonts w:ascii="Calibri" w:hAnsi="Calibri" w:cs="Calibri"/>
+          <w:color w:val="1A1A1A"/>
+        </w:rPr>
+        <w:t xml:space="preserve"> pivot = 8.7</w:t>
+      </w:r>
+      <w:r>
+        <w:rPr>
+          <w:rFonts w:ascii="Calibri" w:hAnsi="Calibri" w:cs="Calibri"/>
+          <w:color w:val="1A1A1A"/>
+        </w:rPr>
+        <w:br/>
+        <w:t xml:space="preserve">• Elements </w:t>
+      </w:r>
+      <w:r>
+        <w:rPr>
+          <w:rFonts w:ascii="Calibri" w:hAnsi="Calibri" w:cs="Calibri"/>
+          <w:color w:val="1A1A1A"/>
+        </w:rPr>
+        <w:t>≤</w:t>
+      </w:r>
+      <w:r>
+        <w:rPr>
+          <w:rFonts w:ascii="Calibri" w:hAnsi="Calibri" w:cs="Calibri"/>
+          <w:color w:val="1A1A1A"/>
+        </w:rPr>
+        <w:t xml:space="preserve"> 8.7 </w:t>
+      </w:r>
+      <w:r>
+        <w:rPr>
+          <w:rFonts w:ascii="Calibri" w:hAnsi="Calibri" w:cs="Calibri"/>
+          <w:color w:val="1A1A1A"/>
+        </w:rPr>
+        <w:t>→</w:t>
+      </w:r>
+      <w:r>
+        <w:rPr>
+          <w:rFonts w:ascii="Calibri" w:hAnsi="Calibri" w:cs="Calibri"/>
+          <w:color w:val="1A1A1A"/>
+        </w:rPr>
+        <w:t xml:space="preserve"> [8.2, 6.5, 7.3]</w:t>
+      </w:r>
+      <w:r>
+        <w:rPr>
+          <w:rFonts w:ascii="Calibri" w:hAnsi="Calibri" w:cs="Calibri"/>
+          <w:color w:val="1A1A1A"/>
+        </w:rPr>
+        <w:br/>
+        <w:t xml:space="preserve">• Elements &gt; 8.7 </w:t>
+      </w:r>
+      <w:r>
+        <w:rPr>
+          <w:rFonts w:ascii="Calibri" w:hAnsi="Calibri" w:cs="Calibri"/>
+          <w:color w:val="1A1A1A"/>
+        </w:rPr>
+        <w:t>→</w:t>
+      </w:r>
+      <w:r>
+        <w:rPr>
+          <w:rFonts w:ascii="Calibri" w:hAnsi="Calibri" w:cs="Calibri"/>
+          <w:color w:val="1A1A1A"/>
+        </w:rPr>
+        <w:t xml:space="preserve"> [9.0]</w:t>
+      </w:r>
+      <w:r>
+        <w:rPr>
+          <w:rFonts w:ascii="Calibri" w:hAnsi="Calibri" w:cs="Calibri"/>
+          <w:color w:val="1A1A1A"/>
+        </w:rPr>
+        <w:br/>
+        <w:t>Array after partition: [8.2, 6.5, 7.3, 8.7, 9.0]</w:t>
+      </w:r>
+    </w:p>
+    <w:p>
+      <w:pPr>
+        <w:pStyle w:val="NormalWeb"/>
+        <w:ind w:left="600" w:right="600"/>
+        <w:divId w:val="1128549756"/>
+        <w:rPr>
+          <w:rFonts w:ascii="Calibri" w:hAnsi="Calibri" w:cs="Calibri"/>
+          <w:color w:val="1A1A1A"/>
+        </w:rPr>
+      </w:pPr>
+      <w:r>
+        <w:rPr>
+          <w:rStyle w:val="Strong"/>
+          <w:rFonts w:ascii="Calibri" w:hAnsi="Calibri" w:cs="Calibri"/>
+          <w:color w:val="1A1A1A"/>
+        </w:rPr>
+        <w:t>Step 2: Recursively Apply Quick Sort</w:t>
+      </w:r>
+      <w:r>
+        <w:rPr>
+          <w:rFonts w:ascii="Calibri" w:hAnsi="Calibri" w:cs="Calibri"/>
+          <w:color w:val="1A1A1A"/>
+        </w:rPr>
+        <w:br/>
+        <w:t>Left subarray: [8.2, 6.5, 7.3]</w:t>
+      </w:r>
+      <w:r>
+        <w:rPr>
+          <w:rFonts w:ascii="Calibri" w:hAnsi="Calibri" w:cs="Calibri"/>
+          <w:color w:val="1A1A1A"/>
+        </w:rPr>
+        <w:br/>
+        <w:t xml:space="preserve">Pivot = 7.3 </w:t>
+      </w:r>
+      <w:r>
+        <w:rPr>
+          <w:rFonts w:ascii="Calibri" w:hAnsi="Calibri" w:cs="Calibri"/>
+          <w:color w:val="1A1A1A"/>
+        </w:rPr>
+        <w:t>→</w:t>
+      </w:r>
+      <w:r>
+        <w:rPr>
+          <w:rFonts w:ascii="Calibri" w:hAnsi="Calibri" w:cs="Calibri"/>
+          <w:color w:val="1A1A1A"/>
+        </w:rPr>
+        <w:t xml:space="preserve"> Partition </w:t>
+      </w:r>
+      <w:r>
+        <w:rPr>
+          <w:rFonts w:ascii="Calibri" w:hAnsi="Calibri" w:cs="Calibri"/>
+          <w:color w:val="1A1A1A"/>
+        </w:rPr>
+        <w:t>→</w:t>
+      </w:r>
+      <w:r>
+        <w:rPr>
+          <w:rFonts w:ascii="Calibri" w:hAnsi="Calibri" w:cs="Calibri"/>
+          <w:color w:val="1A1A1A"/>
+        </w:rPr>
+        <w:t xml:space="preserve"> [6.5, 7.3, 8.2]</w:t>
+      </w:r>
+      <w:r>
+        <w:rPr>
+          <w:rFonts w:ascii="Calibri" w:hAnsi="Calibri" w:cs="Calibri"/>
+          <w:color w:val="1A1A1A"/>
+        </w:rPr>
+        <w:br/>
+        <w:t>Right subarray: [9.0] (already sorted)</w:t>
+      </w:r>
+    </w:p>
+    <w:p>
+      <w:pPr>
+        <w:pStyle w:val="NormalWeb"/>
+        <w:ind w:left="600" w:right="600"/>
+        <w:divId w:val="1128549756"/>
+        <w:rPr>
+          <w:rFonts w:ascii="Calibri" w:hAnsi="Calibri" w:cs="Calibri"/>
+          <w:color w:val="1A1A1A"/>
+        </w:rPr>
+      </w:pPr>
+      <w:r>
+        <w:rPr>
+          <w:rStyle w:val="Strong"/>
+          <w:rFonts w:ascii="Calibri" w:hAnsi="Calibri" w:cs="Calibri"/>
+          <w:color w:val="1A1A1A"/>
+        </w:rPr>
+        <w:t>Step 3: Combine Results</w:t>
+      </w:r>
+      <w:r>
+        <w:rPr>
+          <w:rFonts w:ascii="Calibri" w:hAnsi="Calibri" w:cs="Calibri"/>
+          <w:color w:val="1A1A1A"/>
+        </w:rPr>
+        <w:br/>
+        <w:t xml:space="preserve">Final sorted array by IMDB rating </w:t>
+      </w:r>
+      <w:r>
+        <w:rPr>
+          <w:rFonts w:ascii="Calibri" w:hAnsi="Calibri" w:cs="Calibri"/>
+          <w:color w:val="1A1A1A"/>
+        </w:rPr>
+        <w:t>→</w:t>
+      </w:r>
+      <w:r>
+        <w:rPr>
+          <w:rFonts w:ascii="Calibri" w:hAnsi="Calibri" w:cs="Calibri"/>
+          <w:color w:val="1A1A1A"/>
+        </w:rPr>
+        <w:t xml:space="preserve"> [6.5, 7.3, 8.2, 8.7, 9.0]</w:t>
+      </w:r>
+    </w:p>
+    <w:p>
+      <w:pPr>
+        <w:pStyle w:val="NormalWeb"/>
+        <w:ind w:left="600" w:right="600"/>
+        <w:divId w:val="1128549756"/>
+        <w:rPr>
+          <w:rFonts w:ascii="Calibri" w:hAnsi="Calibri" w:cs="Calibri"/>
+          <w:color w:val="1A1A1A"/>
+        </w:rPr>
+      </w:pPr>
+      <w:r>
+        <w:rPr>
+          <w:rStyle w:val="Strong"/>
+          <w:rFonts w:ascii="Calibri" w:hAnsi="Calibri" w:cs="Calibri"/>
+          <w:color w:val="1A1A1A"/>
+        </w:rPr>
+        <w:t>Final Output</w:t>
+      </w:r>
+      <w:r>
+        <w:rPr>
+          <w:rFonts w:ascii="Calibri" w:hAnsi="Calibri" w:cs="Calibri"/>
+          <w:color w:val="1A1A1A"/>
+        </w:rPr>
+        <w:br/>
+      </w:r>
+      <w:r>
+        <w:rPr>
+          <w:rFonts w:ascii="Calibri" w:hAnsi="Calibri" w:cs="Calibri"/>
+          <w:color w:val="1A1A1A"/>
+        </w:rPr>
+        <w:t>Movies sorted efficiently based on user-selected parameter (IMDB rating in this case): [6.5, 7.3, 8.2, 8.7, 9.0]</w:t>
+      </w:r>
+    </w:p>
+    <w:p>
+      <w:pPr>
+        <w:pStyle w:val="Heading2"/>
+        <w:ind w:left="600" w:right="600"/>
+        <w:divId w:val="1128549756"/>
+        <w:rPr>
+          <w:rFonts w:ascii="Calibri" w:eastAsia="Times New Roman" w:hAnsi="Calibri" w:cs="Calibri"/>
+        </w:rPr>
+      </w:pPr>
+      <w:r>
+        <w:rPr>
+          <w:rFonts w:ascii="Calibri" w:eastAsia="Times New Roman" w:hAnsi="Calibri" w:cs="Calibri"/>
+        </w:rPr>
+        <w:t>Conclusion:</w:t>
+      </w:r>
+    </w:p>
+    <w:p>
+      <w:pPr>
+        <w:pStyle w:val="NormalWeb"/>
+        <w:ind w:left="600" w:right="600"/>
+        <w:divId w:val="1128549756"/>
+        <w:rPr>
+          <w:rFonts w:ascii="Calibri" w:hAnsi="Calibri" w:cs="Calibri"/>
+          <w:color w:val="1A1A1A"/>
+        </w:rPr>
+      </w:pPr>
+      <w:r>
+        <w:rPr>
+          <w:rFonts w:ascii="Calibri" w:hAnsi="Calibri" w:cs="Calibri"/>
+          <w:color w:val="1A1A1A"/>
+        </w:rPr>
+        <w:t>Quick Sort is an efficient and memory-friendly algorithm ideal for sorting large movie datasets based on user preferences like rating, release year, or popularity. By using Quick Sort, StreamFlix can ensure fast and responsive recommendations even during peak hours, improving performance and user experience.</w:t>
+      </w:r>
+    </w:p>
+    <w:p>
+      <w:pPr>
+        <w:shd w:val="clear" w:color="auto" w:fill="F0F4F8"/>
+        <w:wordWrap w:val="0"/>
+        <w:spacing w:before="225" w:after="600"/>
+        <w:ind w:left="600" w:right="600"/>
+        <w:divId w:val="1686521532"/>
+        <w:rPr>
+          <w:rFonts w:ascii="Calibri" w:eastAsia="Times New Roman" w:hAnsi="Calibri" w:cs="Calibri"/>
+          <w:b/>
+          <w:bCs/>
+          <w:color w:val="1A1A1A"/>
+        </w:rPr>
+      </w:pPr>
+      <w:r>
+        <w:rPr>
+          <w:rFonts w:ascii="Calibri" w:eastAsia="Times New Roman" w:hAnsi="Calibri" w:cs="Calibri"/>
+          <w:b/>
+          <w:bCs/>
+          <w:color w:val="1A1A1A"/>
+        </w:rPr>
+        <w:t xml:space="preserve">GitHub Repository: </w:t>
+      </w:r>
       <w:hyperlink r:id="rId5" w:history="1">
         <w:r>
           <w:rPr>
             <w:rStyle w:val="Hyperlink"/>
-            <w:rFonts w:ascii="Calibri" w:hAnsi="Calibri" w:cs="Calibri"/>
+            <w:rFonts w:ascii="Calibri" w:eastAsia="Times New Roman" w:hAnsi="Calibri" w:cs="Calibri"/>
+            <w:b/>
+            <w:bCs/>
           </w:rPr>
           <w:t>https://github.com/Harshit000-byte/DAA-ASSIGNMENTS-124B1F017-HARSHIT-PANDITA.git</w:t>
         </w:r>
       </w:hyperlink>
-    </w:p>
-    <w:p>
-      <w:pPr>
-        <w:pStyle w:val="Heading2"/>
-        <w:ind w:left="600" w:right="600"/>
-        <w:divId w:val="1978336600"/>
-        <w:rPr>
-          <w:rFonts w:ascii="Calibri" w:eastAsia="Times New Roman" w:hAnsi="Calibri" w:cs="Calibri"/>
-        </w:rPr>
-      </w:pPr>
-      <w:r>
-        <w:rPr>
-          <w:rFonts w:ascii="Calibri" w:eastAsia="Times New Roman" w:hAnsi="Calibri" w:cs="Calibri"/>
-        </w:rPr>
-        <w:t>9. Conclusion:</w:t>
-      </w:r>
-    </w:p>
-    <w:p>
-      <w:pPr>
-        <w:pStyle w:val="NormalWeb"/>
-        <w:ind w:left="600" w:right="600"/>
-        <w:divId w:val="1978336600"/>
-        <w:rPr>
-          <w:rFonts w:ascii="Calibri" w:hAnsi="Calibri" w:cs="Calibri"/>
-          <w:color w:val="1A1A1A"/>
-        </w:rPr>
-      </w:pPr>
-      <w:r>
-        <w:rPr>
-          <w:rFonts w:ascii="Calibri" w:hAnsi="Calibri" w:cs="Calibri"/>
-          <w:color w:val="1A1A1A"/>
-        </w:rPr>
-        <w:t>Quick Sort is an efficient and memory-friendly algorithm ideal for sorting large movie datasets based on user preferences like IMDb rating, release year, or watch time popularity. By utilizing Quick Sort, StreamFlix ensures fast and responsive recommendations during peak traffic.</w:t>
+      <w:r>
+        <w:rPr>
+          <w:rFonts w:ascii="Calibri" w:eastAsia="Times New Roman" w:hAnsi="Calibri" w:cs="Calibri"/>
+          <w:b/>
+          <w:bCs/>
+          <w:color w:val="1A1A1A"/>
+        </w:rPr>
+        <w:t xml:space="preserve"> </w:t>
       </w:r>
     </w:p>
     <w:sectPr>
@@ -1908,9 +3266,9 @@
 <file path=word/numbering.xml><?xml version="1.0" encoding="utf-8"?>
 <w:numbering xmlns:wpc="http://schemas.microsoft.com/office/word/2010/wordprocessingCanvas" xmlns:cx="http://schemas.microsoft.com/office/drawing/2014/chartex" xmlns:cx1="http://schemas.microsoft.com/office/drawing/2015/9/8/chartex" xmlns:cx2="http://schemas.microsoft.com/office/drawing/2015/10/21/chartex" xmlns:cx3="http://schemas.microsoft.com/office/drawing/2016/5/9/chartex" xmlns:cx4="http://schemas.microsoft.com/office/drawing/2016/5/10/chartex" xmlns:cx5="http://schemas.microsoft.com/office/drawing/2016/5/11/chartex" xmlns:cx6="http://schemas.microsoft.com/office/drawing/2016/5/12/chartex" xmlns:cx7="http://schemas.microsoft.com/office/drawing/2016/5/13/chartex" xmlns:cx8="http://schemas.microsoft.com/office/drawing/2016/5/14/chartex" xmlns:mc="http://schemas.openxmlformats.org/markup-compatibility/2006" xmlns:aink="http://schemas.microsoft.com/office/drawing/2016/ink" xmlns:am3d="http://schemas.microsoft.com/office/drawing/2017/model3d" xmlns:o="urn:schemas-microsoft-com:office:office" xmlns:oel="http://schemas.microsoft.com/office/2019/extlst" xmlns:r="http://schemas.openxmlformats.org/officeDocument/2006/relationships" xmlns:m="http://schemas.openxmlformats.org/officeDocument/2006/math" xmlns:v="urn:schemas-microsoft-com:vml" xmlns:wp14="http://schemas.microsoft.com/office/word/2010/wordprocessingDrawing" xmlns:wp="http://schemas.openxmlformats.org/drawingml/2006/wordprocessingDrawing" xmlns:w10="urn:schemas-microsoft-com:office:word" xmlns:w="http://schemas.openxmlformats.org/wordprocessingml/2006/main" xmlns:w14="http://schemas.microsoft.com/office/word/2010/wordml" xmlns:w15="http://schemas.microsoft.com/office/word/2012/wordml" xmlns:w16cex="http://schemas.microsoft.com/office/word/2018/wordml/cex" xmlns:w16cid="http://schemas.microsoft.com/office/word/2016/wordml/cid" xmlns:w16="http://schemas.microsoft.com/office/word/2018/wordml" xmlns:w16du="http://schemas.microsoft.com/office/word/2023/wordml/word16du" xmlns:w16sdtdh="http://schemas.microsoft.com/office/word/2020/wordml/sdtdatahash" xmlns:w16sdtfl="http://schemas.microsoft.com/office/word/2024/wordml/sdtformatlock" xmlns:w16se="http://schemas.microsoft.com/office/word/2015/wordml/symex" xmlns:wpg="http://schemas.microsoft.com/office/word/2010/wordprocessingGroup" xmlns:wpi="http://schemas.microsoft.com/office/word/2010/wordprocessingInk" xmlns:wne="http://schemas.microsoft.com/office/word/2006/wordml" xmlns:wps="http://schemas.microsoft.com/office/word/2010/wordprocessingShape" mc:Ignorable="w14 w15 w16se w16cid w16 w16cex w16sdtdh w16sdtfl w16du wp14">
   <w:abstractNum w:abstractNumId="0" w15:restartNumberingAfterBreak="0">
-    <w:nsid w:val="1E474E32"/>
+    <w:nsid w:val="20091E1E"/>
     <w:multiLevelType w:val="multilevel"/>
-    <w:tmpl w:val="30B2767C"/>
+    <w:tmpl w:val="3C3659C2"/>
     <w:lvl w:ilvl="0">
       <w:start w:val="1"/>
       <w:numFmt w:val="bullet"/>
@@ -2057,9 +3415,9 @@
     </w:lvl>
   </w:abstractNum>
   <w:abstractNum w:abstractNumId="1" w15:restartNumberingAfterBreak="0">
-    <w:nsid w:val="1F7909D7"/>
+    <w:nsid w:val="39955232"/>
     <w:multiLevelType w:val="multilevel"/>
-    <w:tmpl w:val="69345FBE"/>
+    <w:tmpl w:val="37DEAC4E"/>
     <w:lvl w:ilvl="0">
       <w:start w:val="1"/>
       <w:numFmt w:val="bullet"/>
@@ -2206,9 +3564,9 @@
     </w:lvl>
   </w:abstractNum>
   <w:abstractNum w:abstractNumId="2" w15:restartNumberingAfterBreak="0">
-    <w:nsid w:val="597E7B21"/>
+    <w:nsid w:val="41535FD7"/>
     <w:multiLevelType w:val="multilevel"/>
-    <w:tmpl w:val="07967210"/>
+    <w:tmpl w:val="2BA85086"/>
     <w:lvl w:ilvl="0">
       <w:start w:val="1"/>
       <w:numFmt w:val="bullet"/>
@@ -2354,166 +3712,14 @@
       </w:rPr>
     </w:lvl>
   </w:abstractNum>
-  <w:abstractNum w:abstractNumId="3" w15:restartNumberingAfterBreak="0">
-    <w:nsid w:val="7CEC3F78"/>
-    <w:multiLevelType w:val="multilevel"/>
-    <w:tmpl w:val="48368EA8"/>
-    <w:lvl w:ilvl="0">
-      <w:start w:val="1"/>
-      <w:numFmt w:val="bullet"/>
-      <w:lvlText w:val=""/>
-      <w:lvlJc w:val="left"/>
-      <w:pPr>
-        <w:tabs>
-          <w:tab w:val="num" w:pos="720"/>
-        </w:tabs>
-        <w:ind w:left="720" w:hanging="360"/>
-      </w:pPr>
-      <w:rPr>
-        <w:rFonts w:ascii="Symbol" w:hAnsi="Symbol" w:hint="default"/>
-        <w:sz w:val="20"/>
-      </w:rPr>
-    </w:lvl>
-    <w:lvl w:ilvl="1" w:tentative="1">
-      <w:start w:val="1"/>
-      <w:numFmt w:val="bullet"/>
-      <w:lvlText w:val="o"/>
-      <w:lvlJc w:val="left"/>
-      <w:pPr>
-        <w:tabs>
-          <w:tab w:val="num" w:pos="1440"/>
-        </w:tabs>
-        <w:ind w:left="1440" w:hanging="360"/>
-      </w:pPr>
-      <w:rPr>
-        <w:rFonts w:ascii="Courier New" w:hAnsi="Courier New" w:hint="default"/>
-        <w:sz w:val="20"/>
-      </w:rPr>
-    </w:lvl>
-    <w:lvl w:ilvl="2" w:tentative="1">
-      <w:start w:val="1"/>
-      <w:numFmt w:val="bullet"/>
-      <w:lvlText w:val=""/>
-      <w:lvlJc w:val="left"/>
-      <w:pPr>
-        <w:tabs>
-          <w:tab w:val="num" w:pos="2160"/>
-        </w:tabs>
-        <w:ind w:left="2160" w:hanging="360"/>
-      </w:pPr>
-      <w:rPr>
-        <w:rFonts w:ascii="Wingdings" w:hAnsi="Wingdings" w:hint="default"/>
-        <w:sz w:val="20"/>
-      </w:rPr>
-    </w:lvl>
-    <w:lvl w:ilvl="3" w:tentative="1">
-      <w:start w:val="1"/>
-      <w:numFmt w:val="bullet"/>
-      <w:lvlText w:val=""/>
-      <w:lvlJc w:val="left"/>
-      <w:pPr>
-        <w:tabs>
-          <w:tab w:val="num" w:pos="2880"/>
-        </w:tabs>
-        <w:ind w:left="2880" w:hanging="360"/>
-      </w:pPr>
-      <w:rPr>
-        <w:rFonts w:ascii="Wingdings" w:hAnsi="Wingdings" w:hint="default"/>
-        <w:sz w:val="20"/>
-      </w:rPr>
-    </w:lvl>
-    <w:lvl w:ilvl="4" w:tentative="1">
-      <w:start w:val="1"/>
-      <w:numFmt w:val="bullet"/>
-      <w:lvlText w:val=""/>
-      <w:lvlJc w:val="left"/>
-      <w:pPr>
-        <w:tabs>
-          <w:tab w:val="num" w:pos="3600"/>
-        </w:tabs>
-        <w:ind w:left="3600" w:hanging="360"/>
-      </w:pPr>
-      <w:rPr>
-        <w:rFonts w:ascii="Wingdings" w:hAnsi="Wingdings" w:hint="default"/>
-        <w:sz w:val="20"/>
-      </w:rPr>
-    </w:lvl>
-    <w:lvl w:ilvl="5" w:tentative="1">
-      <w:start w:val="1"/>
-      <w:numFmt w:val="bullet"/>
-      <w:lvlText w:val=""/>
-      <w:lvlJc w:val="left"/>
-      <w:pPr>
-        <w:tabs>
-          <w:tab w:val="num" w:pos="4320"/>
-        </w:tabs>
-        <w:ind w:left="4320" w:hanging="360"/>
-      </w:pPr>
-      <w:rPr>
-        <w:rFonts w:ascii="Wingdings" w:hAnsi="Wingdings" w:hint="default"/>
-        <w:sz w:val="20"/>
-      </w:rPr>
-    </w:lvl>
-    <w:lvl w:ilvl="6" w:tentative="1">
-      <w:start w:val="1"/>
-      <w:numFmt w:val="bullet"/>
-      <w:lvlText w:val=""/>
-      <w:lvlJc w:val="left"/>
-      <w:pPr>
-        <w:tabs>
-          <w:tab w:val="num" w:pos="5040"/>
-        </w:tabs>
-        <w:ind w:left="5040" w:hanging="360"/>
-      </w:pPr>
-      <w:rPr>
-        <w:rFonts w:ascii="Wingdings" w:hAnsi="Wingdings" w:hint="default"/>
-        <w:sz w:val="20"/>
-      </w:rPr>
-    </w:lvl>
-    <w:lvl w:ilvl="7" w:tentative="1">
-      <w:start w:val="1"/>
-      <w:numFmt w:val="bullet"/>
-      <w:lvlText w:val=""/>
-      <w:lvlJc w:val="left"/>
-      <w:pPr>
-        <w:tabs>
-          <w:tab w:val="num" w:pos="5760"/>
-        </w:tabs>
-        <w:ind w:left="5760" w:hanging="360"/>
-      </w:pPr>
-      <w:rPr>
-        <w:rFonts w:ascii="Wingdings" w:hAnsi="Wingdings" w:hint="default"/>
-        <w:sz w:val="20"/>
-      </w:rPr>
-    </w:lvl>
-    <w:lvl w:ilvl="8" w:tentative="1">
-      <w:start w:val="1"/>
-      <w:numFmt w:val="bullet"/>
-      <w:lvlText w:val=""/>
-      <w:lvlJc w:val="left"/>
-      <w:pPr>
-        <w:tabs>
-          <w:tab w:val="num" w:pos="6480"/>
-        </w:tabs>
-        <w:ind w:left="6480" w:hanging="360"/>
-      </w:pPr>
-      <w:rPr>
-        <w:rFonts w:ascii="Wingdings" w:hAnsi="Wingdings" w:hint="default"/>
-        <w:sz w:val="20"/>
-      </w:rPr>
-    </w:lvl>
-  </w:abstractNum>
-  <w:num w:numId="1" w16cid:durableId="735737801">
-    <w:abstractNumId w:val="3"/>
+  <w:num w:numId="1" w16cid:durableId="1957902924">
+    <w:abstractNumId w:val="0"/>
   </w:num>
-  <w:num w:numId="2" w16cid:durableId="1058089641">
-    <w:abstractNumId w:val="1"/>
-  </w:num>
-  <w:num w:numId="3" w16cid:durableId="825164346">
+  <w:num w:numId="2" w16cid:durableId="1325084272">
     <w:abstractNumId w:val="2"/>
   </w:num>
-  <w:num w:numId="4" w16cid:durableId="126439948">
-    <w:abstractNumId w:val="0"/>
+  <w:num w:numId="3" w16cid:durableId="1426534146">
+    <w:abstractNumId w:val="1"/>
   </w:num>
 </w:numbering>
 </file>
@@ -3155,6 +4361,25 @@
       <w:spacing w:before="150" w:after="150"/>
     </w:pPr>
   </w:style>
+  <w:style w:type="paragraph" w:customStyle="1" w:styleId="github-link">
+    <w:name w:val="github-link"/>
+    <w:basedOn w:val="Normal"/>
+    <w:pPr>
+      <w:pBdr>
+        <w:top w:val="single" w:sz="6" w:space="8" w:color="003366"/>
+        <w:left w:val="single" w:sz="6" w:space="8" w:color="003366"/>
+        <w:bottom w:val="single" w:sz="6" w:space="8" w:color="003366"/>
+        <w:right w:val="single" w:sz="6" w:space="8" w:color="003366"/>
+      </w:pBdr>
+      <w:shd w:val="clear" w:color="auto" w:fill="F0F4F8"/>
+      <w:wordWrap w:val="0"/>
+      <w:spacing w:before="225" w:after="100" w:afterAutospacing="1"/>
+    </w:pPr>
+    <w:rPr>
+      <w:b/>
+      <w:bCs/>
+    </w:rPr>
+  </w:style>
   <w:style w:type="paragraph" w:styleId="NormalWeb">
     <w:name w:val="Normal (Web)"/>
     <w:basedOn w:val="Normal"/>

</xml_diff>